<commit_message>
fix(ui): casovy diagram - osa "0 = rozepnuti NC", znacka "NC" misto "OP"; dokumenty jen aktualni stav
ParamDiagrams: OP je od Analyzing 2.6.3 prvni sepnuti NO, cas 0 diagramu je rozepnuti NC
(i18n chart.switchTimesAxisZero). Navody k pouziti bez poznamek o zmenach verzi (RvT, OP,
starsi soubory); snimky detailu zaznamu nafoceny znovu.

Co-Authored-By: Claude Opus 5.5 <noreply@anthropic.com>
</commit_message>
<xml_diff>
--- a/04_docs/manual/ScadaViewer_Instructions_for_Use_EN.docx
+++ b/04_docs/manual/ScadaViewer_Instructions_for_Use_EN.docx
@@ -393,7 +393,7 @@
           <w:szCs w:val="20"/>
         </w:rPr>
         <w:alias w:val="Contents"/>
-        <w:id w:val="-1632472344"/>
+        <w:id w:val="-314579628"/>
       </w:sdtPr>
       <w:sdtEndPr/>
       <w:sdtContent>
@@ -422,7 +422,7 @@
           <w:r>
             <w:fldChar w:fldCharType="separate"/>
           </w:r>
-          <w:hyperlink w:anchor="_Toc244085086" w:history="1">
+          <w:hyperlink w:anchor="_Toc244086426" w:history="1">
             <w:r>
               <w:rPr>
                 <w:rStyle w:val="Hypertextovodkaz"/>
@@ -446,7 +446,7 @@
               <w:rPr>
                 <w:noProof/>
               </w:rPr>
-              <w:instrText xml:space="preserve"> PAGEREF _Toc244085086 \h </w:instrText>
+              <w:instrText xml:space="preserve"> PAGEREF _Toc244086426 \h </w:instrText>
             </w:r>
             <w:r>
               <w:rPr>
@@ -489,7 +489,7 @@
               <w14:ligatures w14:val="standardContextual"/>
             </w:rPr>
           </w:pPr>
-          <w:hyperlink w:anchor="_Toc244085087" w:history="1">
+          <w:hyperlink w:anchor="_Toc244086427" w:history="1">
             <w:r>
               <w:rPr>
                 <w:rStyle w:val="Hypertextovodkaz"/>
@@ -513,7 +513,7 @@
               <w:rPr>
                 <w:noProof/>
               </w:rPr>
-              <w:instrText xml:space="preserve"> PAGEREF _Toc244085087 \h </w:instrText>
+              <w:instrText xml:space="preserve"> PAGEREF _Toc244086427 \h </w:instrText>
             </w:r>
             <w:r>
               <w:rPr>
@@ -556,7 +556,7 @@
               <w14:ligatures w14:val="standardContextual"/>
             </w:rPr>
           </w:pPr>
-          <w:hyperlink w:anchor="_Toc244085088" w:history="1">
+          <w:hyperlink w:anchor="_Toc244086428" w:history="1">
             <w:r>
               <w:rPr>
                 <w:rStyle w:val="Hypertextovodkaz"/>
@@ -580,7 +580,7 @@
               <w:rPr>
                 <w:noProof/>
               </w:rPr>
-              <w:instrText xml:space="preserve"> PAGEREF _Toc244085088 \h </w:instrText>
+              <w:instrText xml:space="preserve"> PAGEREF _Toc244086428 \h </w:instrText>
             </w:r>
             <w:r>
               <w:rPr>
@@ -623,7 +623,7 @@
               <w14:ligatures w14:val="standardContextual"/>
             </w:rPr>
           </w:pPr>
-          <w:hyperlink w:anchor="_Toc244085089" w:history="1">
+          <w:hyperlink w:anchor="_Toc244086429" w:history="1">
             <w:r>
               <w:rPr>
                 <w:rStyle w:val="Hypertextovodkaz"/>
@@ -647,7 +647,7 @@
               <w:rPr>
                 <w:noProof/>
               </w:rPr>
-              <w:instrText xml:space="preserve"> PAGEREF _Toc244085089 \h </w:instrText>
+              <w:instrText xml:space="preserve"> PAGEREF _Toc244086429 \h </w:instrText>
             </w:r>
             <w:r>
               <w:rPr>
@@ -690,7 +690,7 @@
               <w14:ligatures w14:val="standardContextual"/>
             </w:rPr>
           </w:pPr>
-          <w:hyperlink w:anchor="_Toc244085090" w:history="1">
+          <w:hyperlink w:anchor="_Toc244086430" w:history="1">
             <w:r>
               <w:rPr>
                 <w:rStyle w:val="Hypertextovodkaz"/>
@@ -714,7 +714,7 @@
               <w:rPr>
                 <w:noProof/>
               </w:rPr>
-              <w:instrText xml:space="preserve"> PAGEREF _Toc244085090 \h </w:instrText>
+              <w:instrText xml:space="preserve"> PAGEREF _Toc244086430 \h </w:instrText>
             </w:r>
             <w:r>
               <w:rPr>
@@ -757,7 +757,7 @@
               <w14:ligatures w14:val="standardContextual"/>
             </w:rPr>
           </w:pPr>
-          <w:hyperlink w:anchor="_Toc244085091" w:history="1">
+          <w:hyperlink w:anchor="_Toc244086431" w:history="1">
             <w:r>
               <w:rPr>
                 <w:rStyle w:val="Hypertextovodkaz"/>
@@ -781,7 +781,7 @@
               <w:rPr>
                 <w:noProof/>
               </w:rPr>
-              <w:instrText xml:space="preserve"> PAGEREF _Toc244085091 \h </w:instrText>
+              <w:instrText xml:space="preserve"> PAGEREF _Toc244086431 \h </w:instrText>
             </w:r>
             <w:r>
               <w:rPr>
@@ -824,7 +824,7 @@
               <w14:ligatures w14:val="standardContextual"/>
             </w:rPr>
           </w:pPr>
-          <w:hyperlink w:anchor="_Toc244085092" w:history="1">
+          <w:hyperlink w:anchor="_Toc244086432" w:history="1">
             <w:r>
               <w:rPr>
                 <w:rStyle w:val="Hypertextovodkaz"/>
@@ -848,7 +848,7 @@
               <w:rPr>
                 <w:noProof/>
               </w:rPr>
-              <w:instrText xml:space="preserve"> PAGEREF _Toc244085092 \h </w:instrText>
+              <w:instrText xml:space="preserve"> PAGEREF _Toc244086432 \h </w:instrText>
             </w:r>
             <w:r>
               <w:rPr>
@@ -891,7 +891,7 @@
               <w14:ligatures w14:val="standardContextual"/>
             </w:rPr>
           </w:pPr>
-          <w:hyperlink w:anchor="_Toc244085093" w:history="1">
+          <w:hyperlink w:anchor="_Toc244086433" w:history="1">
             <w:r>
               <w:rPr>
                 <w:rStyle w:val="Hypertextovodkaz"/>
@@ -915,7 +915,7 @@
               <w:rPr>
                 <w:noProof/>
               </w:rPr>
-              <w:instrText xml:space="preserve"> PAGEREF _Toc244085093 \h </w:instrText>
+              <w:instrText xml:space="preserve"> PAGEREF _Toc244086433 \h </w:instrText>
             </w:r>
             <w:r>
               <w:rPr>
@@ -958,7 +958,7 @@
               <w14:ligatures w14:val="standardContextual"/>
             </w:rPr>
           </w:pPr>
-          <w:hyperlink w:anchor="_Toc244085094" w:history="1">
+          <w:hyperlink w:anchor="_Toc244086434" w:history="1">
             <w:r>
               <w:rPr>
                 <w:rStyle w:val="Hypertextovodkaz"/>
@@ -982,7 +982,7 @@
               <w:rPr>
                 <w:noProof/>
               </w:rPr>
-              <w:instrText xml:space="preserve"> PAGEREF _Toc244085094 \h </w:instrText>
+              <w:instrText xml:space="preserve"> PAGEREF _Toc244086434 \h </w:instrText>
             </w:r>
             <w:r>
               <w:rPr>
@@ -1025,7 +1025,7 @@
               <w14:ligatures w14:val="standardContextual"/>
             </w:rPr>
           </w:pPr>
-          <w:hyperlink w:anchor="_Toc244085095" w:history="1">
+          <w:hyperlink w:anchor="_Toc244086435" w:history="1">
             <w:r>
               <w:rPr>
                 <w:rStyle w:val="Hypertextovodkaz"/>
@@ -1049,7 +1049,7 @@
               <w:rPr>
                 <w:noProof/>
               </w:rPr>
-              <w:instrText xml:space="preserve"> PAGEREF _Toc244085095 \h </w:instrText>
+              <w:instrText xml:space="preserve"> PAGEREF _Toc244086435 \h </w:instrText>
             </w:r>
             <w:r>
               <w:rPr>
@@ -1092,7 +1092,7 @@
               <w14:ligatures w14:val="standardContextual"/>
             </w:rPr>
           </w:pPr>
-          <w:hyperlink w:anchor="_Toc244085096" w:history="1">
+          <w:hyperlink w:anchor="_Toc244086436" w:history="1">
             <w:r>
               <w:rPr>
                 <w:rStyle w:val="Hypertextovodkaz"/>
@@ -1116,7 +1116,7 @@
               <w:rPr>
                 <w:noProof/>
               </w:rPr>
-              <w:instrText xml:space="preserve"> PAGEREF _Toc244085096 \h </w:instrText>
+              <w:instrText xml:space="preserve"> PAGEREF _Toc244086436 \h </w:instrText>
             </w:r>
             <w:r>
               <w:rPr>
@@ -1159,7 +1159,7 @@
               <w14:ligatures w14:val="standardContextual"/>
             </w:rPr>
           </w:pPr>
-          <w:hyperlink w:anchor="_Toc244085097" w:history="1">
+          <w:hyperlink w:anchor="_Toc244086437" w:history="1">
             <w:r>
               <w:rPr>
                 <w:rStyle w:val="Hypertextovodkaz"/>
@@ -1183,7 +1183,7 @@
               <w:rPr>
                 <w:noProof/>
               </w:rPr>
-              <w:instrText xml:space="preserve"> PAGEREF _Toc244085097 \h </w:instrText>
+              <w:instrText xml:space="preserve"> PAGEREF _Toc244086437 \h </w:instrText>
             </w:r>
             <w:r>
               <w:rPr>
@@ -1226,7 +1226,7 @@
               <w14:ligatures w14:val="standardContextual"/>
             </w:rPr>
           </w:pPr>
-          <w:hyperlink w:anchor="_Toc244085098" w:history="1">
+          <w:hyperlink w:anchor="_Toc244086438" w:history="1">
             <w:r>
               <w:rPr>
                 <w:rStyle w:val="Hypertextovodkaz"/>
@@ -1250,7 +1250,7 @@
               <w:rPr>
                 <w:noProof/>
               </w:rPr>
-              <w:instrText xml:space="preserve"> PAGEREF _Toc244085098 \h </w:instrText>
+              <w:instrText xml:space="preserve"> PAGEREF _Toc244086438 \h </w:instrText>
             </w:r>
             <w:r>
               <w:rPr>
@@ -1293,7 +1293,7 @@
               <w14:ligatures w14:val="standardContextual"/>
             </w:rPr>
           </w:pPr>
-          <w:hyperlink w:anchor="_Toc244085099" w:history="1">
+          <w:hyperlink w:anchor="_Toc244086439" w:history="1">
             <w:r>
               <w:rPr>
                 <w:rStyle w:val="Hypertextovodkaz"/>
@@ -1317,7 +1317,7 @@
               <w:rPr>
                 <w:noProof/>
               </w:rPr>
-              <w:instrText xml:space="preserve"> PAGEREF _Toc244085099 \h </w:instrText>
+              <w:instrText xml:space="preserve"> PAGEREF _Toc244086439 \h </w:instrText>
             </w:r>
             <w:r>
               <w:rPr>
@@ -1360,7 +1360,7 @@
               <w14:ligatures w14:val="standardContextual"/>
             </w:rPr>
           </w:pPr>
-          <w:hyperlink w:anchor="_Toc244085100" w:history="1">
+          <w:hyperlink w:anchor="_Toc244086440" w:history="1">
             <w:r>
               <w:rPr>
                 <w:rStyle w:val="Hypertextovodkaz"/>
@@ -1384,7 +1384,7 @@
               <w:rPr>
                 <w:noProof/>
               </w:rPr>
-              <w:instrText xml:space="preserve"> PAGEREF _Toc244085100 \h </w:instrText>
+              <w:instrText xml:space="preserve"> PAGEREF _Toc244086440 \h </w:instrText>
             </w:r>
             <w:r>
               <w:rPr>
@@ -1427,7 +1427,7 @@
               <w14:ligatures w14:val="standardContextual"/>
             </w:rPr>
           </w:pPr>
-          <w:hyperlink w:anchor="_Toc244085101" w:history="1">
+          <w:hyperlink w:anchor="_Toc244086441" w:history="1">
             <w:r>
               <w:rPr>
                 <w:rStyle w:val="Hypertextovodkaz"/>
@@ -1451,7 +1451,7 @@
               <w:rPr>
                 <w:noProof/>
               </w:rPr>
-              <w:instrText xml:space="preserve"> PAGEREF _Toc244085101 \h </w:instrText>
+              <w:instrText xml:space="preserve"> PAGEREF _Toc244086441 \h </w:instrText>
             </w:r>
             <w:r>
               <w:rPr>
@@ -1494,7 +1494,7 @@
               <w14:ligatures w14:val="standardContextual"/>
             </w:rPr>
           </w:pPr>
-          <w:hyperlink w:anchor="_Toc244085102" w:history="1">
+          <w:hyperlink w:anchor="_Toc244086442" w:history="1">
             <w:r>
               <w:rPr>
                 <w:rStyle w:val="Hypertextovodkaz"/>
@@ -1518,7 +1518,7 @@
               <w:rPr>
                 <w:noProof/>
               </w:rPr>
-              <w:instrText xml:space="preserve"> PAGEREF _Toc244085102 \h </w:instrText>
+              <w:instrText xml:space="preserve"> PAGEREF _Toc244086442 \h </w:instrText>
             </w:r>
             <w:r>
               <w:rPr>
@@ -1561,7 +1561,7 @@
               <w14:ligatures w14:val="standardContextual"/>
             </w:rPr>
           </w:pPr>
-          <w:hyperlink w:anchor="_Toc244085103" w:history="1">
+          <w:hyperlink w:anchor="_Toc244086443" w:history="1">
             <w:r>
               <w:rPr>
                 <w:rStyle w:val="Hypertextovodkaz"/>
@@ -1585,7 +1585,7 @@
               <w:rPr>
                 <w:noProof/>
               </w:rPr>
-              <w:instrText xml:space="preserve"> PAGEREF _Toc244085103 \h </w:instrText>
+              <w:instrText xml:space="preserve"> PAGEREF _Toc244086443 \h </w:instrText>
             </w:r>
             <w:r>
               <w:rPr>
@@ -1628,7 +1628,7 @@
               <w14:ligatures w14:val="standardContextual"/>
             </w:rPr>
           </w:pPr>
-          <w:hyperlink w:anchor="_Toc244085104" w:history="1">
+          <w:hyperlink w:anchor="_Toc244086444" w:history="1">
             <w:r>
               <w:rPr>
                 <w:rStyle w:val="Hypertextovodkaz"/>
@@ -1652,7 +1652,7 @@
               <w:rPr>
                 <w:noProof/>
               </w:rPr>
-              <w:instrText xml:space="preserve"> PAGEREF _Toc244085104 \h </w:instrText>
+              <w:instrText xml:space="preserve"> PAGEREF _Toc244086444 \h </w:instrText>
             </w:r>
             <w:r>
               <w:rPr>
@@ -1695,7 +1695,7 @@
               <w14:ligatures w14:val="standardContextual"/>
             </w:rPr>
           </w:pPr>
-          <w:hyperlink w:anchor="_Toc244085105" w:history="1">
+          <w:hyperlink w:anchor="_Toc244086445" w:history="1">
             <w:r>
               <w:rPr>
                 <w:rStyle w:val="Hypertextovodkaz"/>
@@ -1719,7 +1719,7 @@
               <w:rPr>
                 <w:noProof/>
               </w:rPr>
-              <w:instrText xml:space="preserve"> PAGEREF _Toc244085105 \h </w:instrText>
+              <w:instrText xml:space="preserve"> PAGEREF _Toc244086445 \h </w:instrText>
             </w:r>
             <w:r>
               <w:rPr>
@@ -1762,7 +1762,7 @@
               <w14:ligatures w14:val="standardContextual"/>
             </w:rPr>
           </w:pPr>
-          <w:hyperlink w:anchor="_Toc244085106" w:history="1">
+          <w:hyperlink w:anchor="_Toc244086446" w:history="1">
             <w:r>
               <w:rPr>
                 <w:rStyle w:val="Hypertextovodkaz"/>
@@ -1786,7 +1786,7 @@
               <w:rPr>
                 <w:noProof/>
               </w:rPr>
-              <w:instrText xml:space="preserve"> PAGEREF _Toc244085106 \h </w:instrText>
+              <w:instrText xml:space="preserve"> PAGEREF _Toc244086446 \h </w:instrText>
             </w:r>
             <w:r>
               <w:rPr>
@@ -1829,7 +1829,7 @@
               <w14:ligatures w14:val="standardContextual"/>
             </w:rPr>
           </w:pPr>
-          <w:hyperlink w:anchor="_Toc244085107" w:history="1">
+          <w:hyperlink w:anchor="_Toc244086447" w:history="1">
             <w:r>
               <w:rPr>
                 <w:rStyle w:val="Hypertextovodkaz"/>
@@ -1853,7 +1853,7 @@
               <w:rPr>
                 <w:noProof/>
               </w:rPr>
-              <w:instrText xml:space="preserve"> PAGEREF _Toc244085107 \h </w:instrText>
+              <w:instrText xml:space="preserve"> PAGEREF _Toc244086447 \h </w:instrText>
             </w:r>
             <w:r>
               <w:rPr>
@@ -1896,7 +1896,7 @@
               <w14:ligatures w14:val="standardContextual"/>
             </w:rPr>
           </w:pPr>
-          <w:hyperlink w:anchor="_Toc244085108" w:history="1">
+          <w:hyperlink w:anchor="_Toc244086448" w:history="1">
             <w:r>
               <w:rPr>
                 <w:rStyle w:val="Hypertextovodkaz"/>
@@ -1920,7 +1920,7 @@
               <w:rPr>
                 <w:noProof/>
               </w:rPr>
-              <w:instrText xml:space="preserve"> PAGEREF _Toc244085108 \h </w:instrText>
+              <w:instrText xml:space="preserve"> PAGEREF _Toc244086448 \h </w:instrText>
             </w:r>
             <w:r>
               <w:rPr>
@@ -1963,7 +1963,7 @@
               <w14:ligatures w14:val="standardContextual"/>
             </w:rPr>
           </w:pPr>
-          <w:hyperlink w:anchor="_Toc244085109" w:history="1">
+          <w:hyperlink w:anchor="_Toc244086449" w:history="1">
             <w:r>
               <w:rPr>
                 <w:rStyle w:val="Hypertextovodkaz"/>
@@ -1987,7 +1987,7 @@
               <w:rPr>
                 <w:noProof/>
               </w:rPr>
-              <w:instrText xml:space="preserve"> PAGEREF _Toc244085109 \h </w:instrText>
+              <w:instrText xml:space="preserve"> PAGEREF _Toc244086449 \h </w:instrText>
             </w:r>
             <w:r>
               <w:rPr>
@@ -2030,7 +2030,7 @@
               <w14:ligatures w14:val="standardContextual"/>
             </w:rPr>
           </w:pPr>
-          <w:hyperlink w:anchor="_Toc244085110" w:history="1">
+          <w:hyperlink w:anchor="_Toc244086450" w:history="1">
             <w:r>
               <w:rPr>
                 <w:rStyle w:val="Hypertextovodkaz"/>
@@ -2054,7 +2054,7 @@
               <w:rPr>
                 <w:noProof/>
               </w:rPr>
-              <w:instrText xml:space="preserve"> PAGEREF _Toc244085110 \h </w:instrText>
+              <w:instrText xml:space="preserve"> PAGEREF _Toc244086450 \h </w:instrText>
             </w:r>
             <w:r>
               <w:rPr>
@@ -2097,7 +2097,7 @@
               <w14:ligatures w14:val="standardContextual"/>
             </w:rPr>
           </w:pPr>
-          <w:hyperlink w:anchor="_Toc244085111" w:history="1">
+          <w:hyperlink w:anchor="_Toc244086451" w:history="1">
             <w:r>
               <w:rPr>
                 <w:rStyle w:val="Hypertextovodkaz"/>
@@ -2121,7 +2121,7 @@
               <w:rPr>
                 <w:noProof/>
               </w:rPr>
-              <w:instrText xml:space="preserve"> PAGEREF _Toc244085111 \h </w:instrText>
+              <w:instrText xml:space="preserve"> PAGEREF _Toc244086451 \h </w:instrText>
             </w:r>
             <w:r>
               <w:rPr>
@@ -2164,7 +2164,7 @@
               <w14:ligatures w14:val="standardContextual"/>
             </w:rPr>
           </w:pPr>
-          <w:hyperlink w:anchor="_Toc244085112" w:history="1">
+          <w:hyperlink w:anchor="_Toc244086452" w:history="1">
             <w:r>
               <w:rPr>
                 <w:rStyle w:val="Hypertextovodkaz"/>
@@ -2188,7 +2188,7 @@
               <w:rPr>
                 <w:noProof/>
               </w:rPr>
-              <w:instrText xml:space="preserve"> PAGEREF _Toc244085112 \h </w:instrText>
+              <w:instrText xml:space="preserve"> PAGEREF _Toc244086452 \h </w:instrText>
             </w:r>
             <w:r>
               <w:rPr>
@@ -2231,7 +2231,7 @@
               <w14:ligatures w14:val="standardContextual"/>
             </w:rPr>
           </w:pPr>
-          <w:hyperlink w:anchor="_Toc244085113" w:history="1">
+          <w:hyperlink w:anchor="_Toc244086453" w:history="1">
             <w:r>
               <w:rPr>
                 <w:rStyle w:val="Hypertextovodkaz"/>
@@ -2255,7 +2255,7 @@
               <w:rPr>
                 <w:noProof/>
               </w:rPr>
-              <w:instrText xml:space="preserve"> PAGEREF _Toc244085113 \h </w:instrText>
+              <w:instrText xml:space="preserve"> PAGEREF _Toc244086453 \h </w:instrText>
             </w:r>
             <w:r>
               <w:rPr>
@@ -2298,7 +2298,7 @@
               <w14:ligatures w14:val="standardContextual"/>
             </w:rPr>
           </w:pPr>
-          <w:hyperlink w:anchor="_Toc244085114" w:history="1">
+          <w:hyperlink w:anchor="_Toc244086454" w:history="1">
             <w:r>
               <w:rPr>
                 <w:rStyle w:val="Hypertextovodkaz"/>
@@ -2322,7 +2322,7 @@
               <w:rPr>
                 <w:noProof/>
               </w:rPr>
-              <w:instrText xml:space="preserve"> PAGEREF _Toc244085114 \h </w:instrText>
+              <w:instrText xml:space="preserve"> PAGEREF _Toc244086454 \h </w:instrText>
             </w:r>
             <w:r>
               <w:rPr>
@@ -2365,7 +2365,7 @@
               <w14:ligatures w14:val="standardContextual"/>
             </w:rPr>
           </w:pPr>
-          <w:hyperlink w:anchor="_Toc244085115" w:history="1">
+          <w:hyperlink w:anchor="_Toc244086455" w:history="1">
             <w:r>
               <w:rPr>
                 <w:rStyle w:val="Hypertextovodkaz"/>
@@ -2389,7 +2389,7 @@
               <w:rPr>
                 <w:noProof/>
               </w:rPr>
-              <w:instrText xml:space="preserve"> PAGEREF _Toc244085115 \h </w:instrText>
+              <w:instrText xml:space="preserve"> PAGEREF _Toc244086455 \h </w:instrText>
             </w:r>
             <w:r>
               <w:rPr>
@@ -2432,7 +2432,7 @@
               <w14:ligatures w14:val="standardContextual"/>
             </w:rPr>
           </w:pPr>
-          <w:hyperlink w:anchor="_Toc244085116" w:history="1">
+          <w:hyperlink w:anchor="_Toc244086456" w:history="1">
             <w:r>
               <w:rPr>
                 <w:rStyle w:val="Hypertextovodkaz"/>
@@ -2456,7 +2456,7 @@
               <w:rPr>
                 <w:noProof/>
               </w:rPr>
-              <w:instrText xml:space="preserve"> PAGEREF _Toc244085116 \h </w:instrText>
+              <w:instrText xml:space="preserve"> PAGEREF _Toc244086456 \h </w:instrText>
             </w:r>
             <w:r>
               <w:rPr>
@@ -2499,7 +2499,7 @@
               <w14:ligatures w14:val="standardContextual"/>
             </w:rPr>
           </w:pPr>
-          <w:hyperlink w:anchor="_Toc244085117" w:history="1">
+          <w:hyperlink w:anchor="_Toc244086457" w:history="1">
             <w:r>
               <w:rPr>
                 <w:rStyle w:val="Hypertextovodkaz"/>
@@ -2523,7 +2523,7 @@
               <w:rPr>
                 <w:noProof/>
               </w:rPr>
-              <w:instrText xml:space="preserve"> PAGEREF _Toc244085117 \h </w:instrText>
+              <w:instrText xml:space="preserve"> PAGEREF _Toc244086457 \h </w:instrText>
             </w:r>
             <w:r>
               <w:rPr>
@@ -2566,7 +2566,7 @@
               <w14:ligatures w14:val="standardContextual"/>
             </w:rPr>
           </w:pPr>
-          <w:hyperlink w:anchor="_Toc244085118" w:history="1">
+          <w:hyperlink w:anchor="_Toc244086458" w:history="1">
             <w:r>
               <w:rPr>
                 <w:rStyle w:val="Hypertextovodkaz"/>
@@ -2590,7 +2590,7 @@
               <w:rPr>
                 <w:noProof/>
               </w:rPr>
-              <w:instrText xml:space="preserve"> PAGEREF _Toc244085118 \h </w:instrText>
+              <w:instrText xml:space="preserve"> PAGEREF _Toc244086458 \h </w:instrText>
             </w:r>
             <w:r>
               <w:rPr>
@@ -2633,7 +2633,7 @@
               <w14:ligatures w14:val="standardContextual"/>
             </w:rPr>
           </w:pPr>
-          <w:hyperlink w:anchor="_Toc244085119" w:history="1">
+          <w:hyperlink w:anchor="_Toc244086459" w:history="1">
             <w:r>
               <w:rPr>
                 <w:rStyle w:val="Hypertextovodkaz"/>
@@ -2657,7 +2657,7 @@
               <w:rPr>
                 <w:noProof/>
               </w:rPr>
-              <w:instrText xml:space="preserve"> PAGEREF _Toc244085119 \h </w:instrText>
+              <w:instrText xml:space="preserve"> PAGEREF _Toc244086459 \h </w:instrText>
             </w:r>
             <w:r>
               <w:rPr>
@@ -2700,7 +2700,7 @@
               <w14:ligatures w14:val="standardContextual"/>
             </w:rPr>
           </w:pPr>
-          <w:hyperlink w:anchor="_Toc244085120" w:history="1">
+          <w:hyperlink w:anchor="_Toc244086460" w:history="1">
             <w:r>
               <w:rPr>
                 <w:rStyle w:val="Hypertextovodkaz"/>
@@ -2724,7 +2724,7 @@
               <w:rPr>
                 <w:noProof/>
               </w:rPr>
-              <w:instrText xml:space="preserve"> PAGEREF _Toc244085120 \h </w:instrText>
+              <w:instrText xml:space="preserve"> PAGEREF _Toc244086460 \h </w:instrText>
             </w:r>
             <w:r>
               <w:rPr>
@@ -2767,7 +2767,7 @@
               <w14:ligatures w14:val="standardContextual"/>
             </w:rPr>
           </w:pPr>
-          <w:hyperlink w:anchor="_Toc244085121" w:history="1">
+          <w:hyperlink w:anchor="_Toc244086461" w:history="1">
             <w:r>
               <w:rPr>
                 <w:rStyle w:val="Hypertextovodkaz"/>
@@ -2791,7 +2791,7 @@
               <w:rPr>
                 <w:noProof/>
               </w:rPr>
-              <w:instrText xml:space="preserve"> PAGEREF _Toc244085121 \h </w:instrText>
+              <w:instrText xml:space="preserve"> PAGEREF _Toc244086461 \h </w:instrText>
             </w:r>
             <w:r>
               <w:rPr>
@@ -2834,7 +2834,7 @@
               <w14:ligatures w14:val="standardContextual"/>
             </w:rPr>
           </w:pPr>
-          <w:hyperlink w:anchor="_Toc244085122" w:history="1">
+          <w:hyperlink w:anchor="_Toc244086462" w:history="1">
             <w:r>
               <w:rPr>
                 <w:rStyle w:val="Hypertextovodkaz"/>
@@ -2858,7 +2858,7 @@
               <w:rPr>
                 <w:noProof/>
               </w:rPr>
-              <w:instrText xml:space="preserve"> PAGEREF _Toc244085122 \h </w:instrText>
+              <w:instrText xml:space="preserve"> PAGEREF _Toc244086462 \h </w:instrText>
             </w:r>
             <w:r>
               <w:rPr>
@@ -2901,7 +2901,7 @@
               <w14:ligatures w14:val="standardContextual"/>
             </w:rPr>
           </w:pPr>
-          <w:hyperlink w:anchor="_Toc244085123" w:history="1">
+          <w:hyperlink w:anchor="_Toc244086463" w:history="1">
             <w:r>
               <w:rPr>
                 <w:rStyle w:val="Hypertextovodkaz"/>
@@ -2925,7 +2925,7 @@
               <w:rPr>
                 <w:noProof/>
               </w:rPr>
-              <w:instrText xml:space="preserve"> PAGEREF _Toc244085123 \h </w:instrText>
+              <w:instrText xml:space="preserve"> PAGEREF _Toc244086463 \h </w:instrText>
             </w:r>
             <w:r>
               <w:rPr>
@@ -2968,7 +2968,7 @@
               <w14:ligatures w14:val="standardContextual"/>
             </w:rPr>
           </w:pPr>
-          <w:hyperlink w:anchor="_Toc244085124" w:history="1">
+          <w:hyperlink w:anchor="_Toc244086464" w:history="1">
             <w:r>
               <w:rPr>
                 <w:rStyle w:val="Hypertextovodkaz"/>
@@ -2992,7 +2992,7 @@
               <w:rPr>
                 <w:noProof/>
               </w:rPr>
-              <w:instrText xml:space="preserve"> PAGEREF _Toc244085124 \h </w:instrText>
+              <w:instrText xml:space="preserve"> PAGEREF _Toc244086464 \h </w:instrText>
             </w:r>
             <w:r>
               <w:rPr>
@@ -3035,7 +3035,7 @@
               <w14:ligatures w14:val="standardContextual"/>
             </w:rPr>
           </w:pPr>
-          <w:hyperlink w:anchor="_Toc244085125" w:history="1">
+          <w:hyperlink w:anchor="_Toc244086465" w:history="1">
             <w:r>
               <w:rPr>
                 <w:rStyle w:val="Hypertextovodkaz"/>
@@ -3059,7 +3059,7 @@
               <w:rPr>
                 <w:noProof/>
               </w:rPr>
-              <w:instrText xml:space="preserve"> PAGEREF _Toc244085125 \h </w:instrText>
+              <w:instrText xml:space="preserve"> PAGEREF _Toc244086465 \h </w:instrText>
             </w:r>
             <w:r>
               <w:rPr>
@@ -3102,7 +3102,7 @@
               <w14:ligatures w14:val="standardContextual"/>
             </w:rPr>
           </w:pPr>
-          <w:hyperlink w:anchor="_Toc244085126" w:history="1">
+          <w:hyperlink w:anchor="_Toc244086466" w:history="1">
             <w:r>
               <w:rPr>
                 <w:rStyle w:val="Hypertextovodkaz"/>
@@ -3126,7 +3126,7 @@
               <w:rPr>
                 <w:noProof/>
               </w:rPr>
-              <w:instrText xml:space="preserve"> PAGEREF _Toc244085126 \h </w:instrText>
+              <w:instrText xml:space="preserve"> PAGEREF _Toc244086466 \h </w:instrText>
             </w:r>
             <w:r>
               <w:rPr>
@@ -3169,7 +3169,7 @@
               <w14:ligatures w14:val="standardContextual"/>
             </w:rPr>
           </w:pPr>
-          <w:hyperlink w:anchor="_Toc244085127" w:history="1">
+          <w:hyperlink w:anchor="_Toc244086467" w:history="1">
             <w:r>
               <w:rPr>
                 <w:rStyle w:val="Hypertextovodkaz"/>
@@ -3193,7 +3193,7 @@
               <w:rPr>
                 <w:noProof/>
               </w:rPr>
-              <w:instrText xml:space="preserve"> PAGEREF _Toc244085127 \h </w:instrText>
+              <w:instrText xml:space="preserve"> PAGEREF _Toc244086467 \h </w:instrText>
             </w:r>
             <w:r>
               <w:rPr>
@@ -3236,7 +3236,7 @@
               <w14:ligatures w14:val="standardContextual"/>
             </w:rPr>
           </w:pPr>
-          <w:hyperlink w:anchor="_Toc244085128" w:history="1">
+          <w:hyperlink w:anchor="_Toc244086468" w:history="1">
             <w:r>
               <w:rPr>
                 <w:rStyle w:val="Hypertextovodkaz"/>
@@ -3260,7 +3260,7 @@
               <w:rPr>
                 <w:noProof/>
               </w:rPr>
-              <w:instrText xml:space="preserve"> PAGEREF _Toc244085128 \h </w:instrText>
+              <w:instrText xml:space="preserve"> PAGEREF _Toc244086468 \h </w:instrText>
             </w:r>
             <w:r>
               <w:rPr>
@@ -3303,7 +3303,7 @@
               <w14:ligatures w14:val="standardContextual"/>
             </w:rPr>
           </w:pPr>
-          <w:hyperlink w:anchor="_Toc244085129" w:history="1">
+          <w:hyperlink w:anchor="_Toc244086469" w:history="1">
             <w:r>
               <w:rPr>
                 <w:rStyle w:val="Hypertextovodkaz"/>
@@ -3327,7 +3327,7 @@
               <w:rPr>
                 <w:noProof/>
               </w:rPr>
-              <w:instrText xml:space="preserve"> PAGEREF _Toc244085129 \h </w:instrText>
+              <w:instrText xml:space="preserve"> PAGEREF _Toc244086469 \h </w:instrText>
             </w:r>
             <w:r>
               <w:rPr>
@@ -3370,7 +3370,7 @@
               <w14:ligatures w14:val="standardContextual"/>
             </w:rPr>
           </w:pPr>
-          <w:hyperlink w:anchor="_Toc244085130" w:history="1">
+          <w:hyperlink w:anchor="_Toc244086470" w:history="1">
             <w:r>
               <w:rPr>
                 <w:rStyle w:val="Hypertextovodkaz"/>
@@ -3394,7 +3394,7 @@
               <w:rPr>
                 <w:noProof/>
               </w:rPr>
-              <w:instrText xml:space="preserve"> PAGEREF _Toc244085130 \h </w:instrText>
+              <w:instrText xml:space="preserve"> PAGEREF _Toc244086470 \h </w:instrText>
             </w:r>
             <w:r>
               <w:rPr>
@@ -3437,7 +3437,7 @@
               <w14:ligatures w14:val="standardContextual"/>
             </w:rPr>
           </w:pPr>
-          <w:hyperlink w:anchor="_Toc244085131" w:history="1">
+          <w:hyperlink w:anchor="_Toc244086471" w:history="1">
             <w:r>
               <w:rPr>
                 <w:rStyle w:val="Hypertextovodkaz"/>
@@ -3461,7 +3461,7 @@
               <w:rPr>
                 <w:noProof/>
               </w:rPr>
-              <w:instrText xml:space="preserve"> PAGEREF _Toc244085131 \h </w:instrText>
+              <w:instrText xml:space="preserve"> PAGEREF _Toc244086471 \h </w:instrText>
             </w:r>
             <w:r>
               <w:rPr>
@@ -3504,7 +3504,7 @@
               <w14:ligatures w14:val="standardContextual"/>
             </w:rPr>
           </w:pPr>
-          <w:hyperlink w:anchor="_Toc244085132" w:history="1">
+          <w:hyperlink w:anchor="_Toc244086472" w:history="1">
             <w:r>
               <w:rPr>
                 <w:rStyle w:val="Hypertextovodkaz"/>
@@ -3528,7 +3528,7 @@
               <w:rPr>
                 <w:noProof/>
               </w:rPr>
-              <w:instrText xml:space="preserve"> PAGEREF _Toc244085132 \h </w:instrText>
+              <w:instrText xml:space="preserve"> PAGEREF _Toc244086472 \h </w:instrText>
             </w:r>
             <w:r>
               <w:rPr>
@@ -3571,7 +3571,7 @@
               <w14:ligatures w14:val="standardContextual"/>
             </w:rPr>
           </w:pPr>
-          <w:hyperlink w:anchor="_Toc244085133" w:history="1">
+          <w:hyperlink w:anchor="_Toc244086473" w:history="1">
             <w:r>
               <w:rPr>
                 <w:rStyle w:val="Hypertextovodkaz"/>
@@ -3595,7 +3595,7 @@
               <w:rPr>
                 <w:noProof/>
               </w:rPr>
-              <w:instrText xml:space="preserve"> PAGEREF _Toc244085133 \h </w:instrText>
+              <w:instrText xml:space="preserve"> PAGEREF _Toc244086473 \h </w:instrText>
             </w:r>
             <w:r>
               <w:rPr>
@@ -3644,7 +3644,7 @@
         <w:pStyle w:val="Nadpis1"/>
         <w:pageBreakBefore/>
       </w:pPr>
-      <w:bookmarkStart w:id="0" w:name="_Toc244085086"/>
+      <w:bookmarkStart w:id="0" w:name="_Toc244086426"/>
       <w:r>
         <w:t>1  Introduction</w:t>
       </w:r>
@@ -3654,7 +3654,7 @@
       <w:pPr>
         <w:pStyle w:val="Nadpis2"/>
       </w:pPr>
-      <w:bookmarkStart w:id="1" w:name="_Toc244085087"/>
+      <w:bookmarkStart w:id="1" w:name="_Toc244086427"/>
       <w:r>
         <w:t>1.1  Purpose of the application</w:t>
       </w:r>
@@ -3863,7 +3863,7 @@
       <w:pPr>
         <w:pStyle w:val="Nadpis2"/>
       </w:pPr>
-      <w:bookmarkStart w:id="2" w:name="_Toc244085088"/>
+      <w:bookmarkStart w:id="2" w:name="_Toc244086428"/>
       <w:r>
         <w:t>1.2  Data flow and file states</w:t>
       </w:r>
@@ -4384,7 +4384,7 @@
         <w:spacing w:after="120" w:line="288" w:lineRule="auto"/>
       </w:pPr>
       <w:r>
-        <w:t xml:space="preserve">Since DatabaseGateway 2.3 the production file has a block structure: </w:t>
+        <w:t xml:space="preserve">The production file has a block structure: </w:t>
       </w:r>
       <w:r>
         <w:rPr>
@@ -4439,7 +4439,7 @@
         <w:t>[Data]</w:t>
       </w:r>
       <w:r>
-        <w:t xml:space="preserve"> (one row per piece). ScadaViewer also reads older files with a simpler header.</w:t>
+        <w:t xml:space="preserve"> (one row per piece).</w:t>
       </w:r>
     </w:p>
     <w:p>
@@ -4454,7 +4454,7 @@
       <w:pPr>
         <w:pStyle w:val="Nadpis2"/>
       </w:pPr>
-      <w:bookmarkStart w:id="3" w:name="_Toc244085089"/>
+      <w:bookmarkStart w:id="3" w:name="_Toc244086429"/>
       <w:r>
         <w:t>1.3  Where the application runs and how to open it</w:t>
       </w:r>
@@ -4524,7 +4524,7 @@
       <w:pPr>
         <w:pStyle w:val="Nadpis2"/>
       </w:pPr>
-      <w:bookmarkStart w:id="4" w:name="_Toc244085090"/>
+      <w:bookmarkStart w:id="4" w:name="_Toc244086430"/>
       <w:r>
         <w:t>1.4  User roles and permissions</w:t>
       </w:r>
@@ -6726,7 +6726,7 @@
       <w:pPr>
         <w:pStyle w:val="Nadpis2"/>
       </w:pPr>
-      <w:bookmarkStart w:id="5" w:name="_Toc244085091"/>
+      <w:bookmarkStart w:id="5" w:name="_Toc244086431"/>
       <w:r>
         <w:t>1.5  About this document</w:t>
       </w:r>
@@ -6748,7 +6748,7 @@
         <w:pStyle w:val="Nadpis1"/>
         <w:pageBreakBefore/>
       </w:pPr>
-      <w:bookmarkStart w:id="6" w:name="_Toc244085092"/>
+      <w:bookmarkStart w:id="6" w:name="_Toc244086432"/>
       <w:r>
         <w:t>2  Sign-in and basic controls</w:t>
       </w:r>
@@ -6758,7 +6758,7 @@
       <w:pPr>
         <w:pStyle w:val="Nadpis2"/>
       </w:pPr>
-      <w:bookmarkStart w:id="7" w:name="_Toc244085093"/>
+      <w:bookmarkStart w:id="7" w:name="_Toc244086433"/>
       <w:r>
         <w:t>2.1  Signing in</w:t>
       </w:r>
@@ -6775,7 +6775,7 @@
           <w:noProof/>
         </w:rPr>
         <w:drawing>
-          <wp:inline distT="0" distB="0" distL="0" distR="0" wp14:anchorId="61A8C73F" wp14:editId="22F09D4C">
+          <wp:inline distT="0" distB="0" distL="0" distR="0" wp14:anchorId="12D4C91D" wp14:editId="08342B04">
             <wp:extent cx="3676650" cy="2066925"/>
             <wp:effectExtent l="0" t="0" r="0" b="0"/>
             <wp:docPr id="1" name="01_login" descr="Sign-in screen on the tester PC" title="Sign-in screen on the tester PC"/>
@@ -6970,7 +6970,7 @@
       <w:pPr>
         <w:pStyle w:val="Nadpis2"/>
       </w:pPr>
-      <w:bookmarkStart w:id="8" w:name="_Toc244085094"/>
+      <w:bookmarkStart w:id="8" w:name="_Toc244086434"/>
       <w:r>
         <w:t>2.2  Top bar</w:t>
       </w:r>
@@ -6987,7 +6987,7 @@
           <w:noProof/>
         </w:rPr>
         <w:drawing>
-          <wp:inline distT="0" distB="0" distL="0" distR="0" wp14:anchorId="03CF252F" wp14:editId="3CD234DF">
+          <wp:inline distT="0" distB="0" distL="0" distR="0" wp14:anchorId="5462E4E2" wp14:editId="70F3A749">
             <wp:extent cx="6124575" cy="266700"/>
             <wp:effectExtent l="0" t="0" r="0" b="0"/>
             <wp:docPr id="2" name="02b_topbar_c" descr="Top bar with password sign-in at the tester (empty middle section omitted)" title="Top bar with password sign-in at the tester (empty middle section omitted)"/>
@@ -7694,7 +7694,7 @@
       <w:pPr>
         <w:pStyle w:val="Nadpis2"/>
       </w:pPr>
-      <w:bookmarkStart w:id="9" w:name="_Toc244085095"/>
+      <w:bookmarkStart w:id="9" w:name="_Toc244086435"/>
       <w:r>
         <w:t>2.3  Menu, help and keyboard shortcuts</w:t>
       </w:r>
@@ -7749,7 +7749,7 @@
           <w:noProof/>
         </w:rPr>
         <w:drawing>
-          <wp:inline distT="0" distB="0" distL="0" distR="0" wp14:anchorId="67431CB6" wp14:editId="14B159D2">
+          <wp:inline distT="0" distB="0" distL="0" distR="0" wp14:anchorId="4E659F05" wp14:editId="2B925444">
             <wp:extent cx="1038225" cy="4676775"/>
             <wp:effectExtent l="0" t="0" r="0" b="0"/>
             <wp:docPr id="3" name="02c_sidebar" descr="Left menu" title="Left menu"/>
@@ -7841,7 +7841,7 @@
           <w:noProof/>
         </w:rPr>
         <w:drawing>
-          <wp:inline distT="0" distB="0" distL="0" distR="0" wp14:anchorId="72CF8FBF" wp14:editId="1FCA9703">
+          <wp:inline distT="0" distB="0" distL="0" distR="0" wp14:anchorId="27B77930" wp14:editId="44B10107">
             <wp:extent cx="3800475" cy="4410075"/>
             <wp:effectExtent l="0" t="0" r="0" b="0"/>
             <wp:docPr id="4" name="02e_help" descr="Help of the Database page" title="Help of the Database page"/>
@@ -7961,7 +7961,7 @@
       <w:pPr>
         <w:pStyle w:val="Nadpis2"/>
       </w:pPr>
-      <w:bookmarkStart w:id="10" w:name="_Toc244085096"/>
+      <w:bookmarkStart w:id="10" w:name="_Toc244086436"/>
       <w:r>
         <w:t>2.4  On-screen keyboard</w:t>
       </w:r>
@@ -8006,7 +8006,7 @@
           <w:noProof/>
         </w:rPr>
         <w:drawing>
-          <wp:inline distT="0" distB="0" distL="0" distR="0" wp14:anchorId="3A10150C" wp14:editId="160447BA">
+          <wp:inline distT="0" distB="0" distL="0" distR="0" wp14:anchorId="5581342C" wp14:editId="58BB5286">
             <wp:extent cx="6124575" cy="3448050"/>
             <wp:effectExtent l="0" t="0" r="0" b="0"/>
             <wp:docPr id="5" name="21b_osk" descr="On-screen keyboard at the Search order field" title="On-screen keyboard at the Search order field"/>
@@ -8074,7 +8074,7 @@
         <w:pStyle w:val="Nadpis1"/>
         <w:pageBreakBefore/>
       </w:pPr>
-      <w:bookmarkStart w:id="11" w:name="_Toc244085097"/>
+      <w:bookmarkStart w:id="11" w:name="_Toc244086437"/>
       <w:r>
         <w:t>3  Database</w:t>
       </w:r>
@@ -8099,7 +8099,7 @@
           <w:noProof/>
         </w:rPr>
         <w:drawing>
-          <wp:inline distT="0" distB="0" distL="0" distR="0" wp14:anchorId="3D40604B" wp14:editId="69BB0026">
+          <wp:inline distT="0" distB="0" distL="0" distR="0" wp14:anchorId="2559D704" wp14:editId="029A835B">
             <wp:extent cx="6124575" cy="3448050"/>
             <wp:effectExtent l="0" t="0" r="0" b="0"/>
             <wp:docPr id="6" name="02_database" descr="Database — orders on the tester PC" title="Database — orders on the tester PC"/>
@@ -8166,7 +8166,7 @@
       <w:pPr>
         <w:pStyle w:val="Nadpis2"/>
       </w:pPr>
-      <w:bookmarkStart w:id="12" w:name="_Toc244085098"/>
+      <w:bookmarkStart w:id="12" w:name="_Toc244086438"/>
       <w:r>
         <w:t>3.1  Order list</w:t>
       </w:r>
@@ -9158,7 +9158,7 @@
       <w:pPr>
         <w:pStyle w:val="Nadpis2"/>
       </w:pPr>
-      <w:bookmarkStart w:id="13" w:name="_Toc244085099"/>
+      <w:bookmarkStart w:id="13" w:name="_Toc244086439"/>
       <w:r>
         <w:t>3.2  Switches, date filter and sorting</w:t>
       </w:r>
@@ -9175,7 +9175,7 @@
           <w:noProof/>
         </w:rPr>
         <w:drawing>
-          <wp:inline distT="0" distB="0" distL="0" distR="0" wp14:anchorId="4601A904" wp14:editId="48BDD7EB">
+          <wp:inline distT="0" distB="0" distL="0" distR="0" wp14:anchorId="7CADF7CC" wp14:editId="390840BA">
             <wp:extent cx="6124575" cy="609600"/>
             <wp:effectExtent l="0" t="0" r="0" b="0"/>
             <wp:docPr id="7" name="02d_controls" descr="Database header: storage indicators and switches" title="Database header: storage indicators and switches"/>
@@ -9352,7 +9352,7 @@
       <w:pPr>
         <w:pStyle w:val="Nadpis2"/>
       </w:pPr>
-      <w:bookmarkStart w:id="14" w:name="_Toc244085100"/>
+      <w:bookmarkStart w:id="14" w:name="_Toc244086440"/>
       <w:r>
         <w:t>3.3  Order search</w:t>
       </w:r>
@@ -9397,7 +9397,7 @@
           <w:noProof/>
         </w:rPr>
         <w:drawing>
-          <wp:inline distT="0" distB="0" distL="0" distR="0" wp14:anchorId="36112791" wp14:editId="4B27AD4F">
+          <wp:inline distT="0" distB="0" distL="0" distR="0" wp14:anchorId="0CA7F478" wp14:editId="225A4B5B">
             <wp:extent cx="6124575" cy="1143000"/>
             <wp:effectExtent l="0" t="0" r="0" b="0"/>
             <wp:docPr id="8" name="03b_search" descr="Searching for an order by part of its number" title="Searching for an order by part of its number"/>
@@ -9464,7 +9464,7 @@
       <w:pPr>
         <w:pStyle w:val="Nadpis2"/>
       </w:pPr>
-      <w:bookmarkStart w:id="15" w:name="_Toc244085101"/>
+      <w:bookmarkStart w:id="15" w:name="_Toc244086441"/>
       <w:r>
         <w:t>3.4  Expanding an order</w:t>
       </w:r>
@@ -9509,7 +9509,7 @@
           <w:noProof/>
         </w:rPr>
         <w:drawing>
-          <wp:inline distT="0" distB="0" distL="0" distR="0" wp14:anchorId="4C307C0D" wp14:editId="7B13DC14">
+          <wp:inline distT="0" distB="0" distL="0" distR="0" wp14:anchorId="7D099887" wp14:editId="742D7544">
             <wp:extent cx="6124575" cy="3448050"/>
             <wp:effectExtent l="0" t="0" r="0" b="0"/>
             <wp:docPr id="9" name="03_expanded" descr="Order expanded in the list (the piece table scrolls)" title="Order expanded in the list (the piece table scrolls)"/>
@@ -9576,7 +9576,7 @@
       <w:pPr>
         <w:pStyle w:val="Nadpis2"/>
       </w:pPr>
-      <w:bookmarkStart w:id="16" w:name="_Toc244085102"/>
+      <w:bookmarkStart w:id="16" w:name="_Toc244086442"/>
       <w:r>
         <w:t>3.5  Storage: local, NAS and USB flash drive</w:t>
       </w:r>
@@ -9601,7 +9601,7 @@
           <w:noProof/>
         </w:rPr>
         <w:drawing>
-          <wp:inline distT="0" distB="0" distL="0" distR="0" wp14:anchorId="43EEF7E8" wp14:editId="41A956DF">
+          <wp:inline distT="0" distB="0" distL="0" distR="0" wp14:anchorId="0EF8A638" wp14:editId="740D7733">
             <wp:extent cx="2143125" cy="323850"/>
             <wp:effectExtent l="0" t="0" r="0" b="0"/>
             <wp:docPr id="10" name="04a_storagebar" descr="Local storage" title="Local storage"/>
@@ -9745,7 +9745,7 @@
           <w:noProof/>
         </w:rPr>
         <w:drawing>
-          <wp:inline distT="0" distB="0" distL="0" distR="0" wp14:anchorId="18768FD1" wp14:editId="1778007F">
+          <wp:inline distT="0" distB="0" distL="0" distR="0" wp14:anchorId="43A2DCF5" wp14:editId="5A037F8A">
             <wp:extent cx="1885950" cy="323850"/>
             <wp:effectExtent l="0" t="0" r="0" b="0"/>
             <wp:docPr id="11" name="04b_nasbar" descr="NAS usage" title="NAS usage"/>
@@ -9819,7 +9819,7 @@
           <w:noProof/>
         </w:rPr>
         <w:drawing>
-          <wp:inline distT="0" distB="0" distL="0" distR="0" wp14:anchorId="71B7CB1F" wp14:editId="32F84CF0">
+          <wp:inline distT="0" distB="0" distL="0" distR="0" wp14:anchorId="5340B77C" wp14:editId="74CBEE87">
             <wp:extent cx="1524000" cy="323850"/>
             <wp:effectExtent l="0" t="0" r="0" b="0"/>
             <wp:docPr id="12" name="04c_usbbar" descr="USB flash drive at the tester with the safe-removal button" title="USB flash drive at the tester with the safe-removal button"/>
@@ -9958,7 +9958,7 @@
           <w:noProof/>
         </w:rPr>
         <w:drawing>
-          <wp:inline distT="0" distB="0" distL="0" distR="0" wp14:anchorId="7AAC6395" wp14:editId="42754783">
+          <wp:inline distT="0" distB="0" distL="0" distR="0" wp14:anchorId="4E8AB31E" wp14:editId="3A066C53">
             <wp:extent cx="2647950" cy="1990725"/>
             <wp:effectExtent l="0" t="0" r="0" b="0"/>
             <wp:docPr id="13" name="04_storage" descr="Confirming clean-up of synced files" title="Confirming clean-up of synced files"/>
@@ -10046,7 +10046,7 @@
       <w:pPr>
         <w:pStyle w:val="Nadpis2"/>
       </w:pPr>
-      <w:bookmarkStart w:id="17" w:name="_Toc244085103"/>
+      <w:bookmarkStart w:id="17" w:name="_Toc244086443"/>
       <w:r>
         <w:t>3.6  Downloading data (CSV, XLSX)</w:t>
       </w:r>
@@ -10158,7 +10158,7 @@
       <w:pPr>
         <w:pStyle w:val="Nadpis2"/>
       </w:pPr>
-      <w:bookmarkStart w:id="18" w:name="_Toc244085104"/>
+      <w:bookmarkStart w:id="18" w:name="_Toc244086444"/>
       <w:r>
         <w:t>3.7  Bulk download</w:t>
       </w:r>
@@ -10213,7 +10213,7 @@
           <w:noProof/>
         </w:rPr>
         <w:drawing>
-          <wp:inline distT="0" distB="0" distL="0" distR="0" wp14:anchorId="28453426" wp14:editId="01EE5B31">
+          <wp:inline distT="0" distB="0" distL="0" distR="0" wp14:anchorId="2376919B" wp14:editId="16BCBEE7">
             <wp:extent cx="6124575" cy="3190875"/>
             <wp:effectExtent l="0" t="0" r="0" b="0"/>
             <wp:docPr id="14" name="05_selection" descr="Selecting files — Download selected, Delete selected" title="Selecting files — Download selected, Delete selected"/>
@@ -10325,7 +10325,7 @@
           <w:noProof/>
         </w:rPr>
         <w:drawing>
-          <wp:inline distT="0" distB="0" distL="0" distR="0" wp14:anchorId="302D21EC" wp14:editId="4E7B1A46">
+          <wp:inline distT="0" distB="0" distL="0" distR="0" wp14:anchorId="61F4645B" wp14:editId="77BAD8FD">
             <wp:extent cx="3000375" cy="2171700"/>
             <wp:effectExtent l="0" t="0" r="0" b="0"/>
             <wp:docPr id="15" name="05b_bulk" descr="Bulk download of all orders of a period" title="Bulk download of all orders of a period"/>
@@ -10513,7 +10513,7 @@
           <w:noProof/>
         </w:rPr>
         <w:drawing>
-          <wp:inline distT="0" distB="0" distL="0" distR="0" wp14:anchorId="63ABE178" wp14:editId="53F5A3F7">
+          <wp:inline distT="0" distB="0" distL="0" distR="0" wp14:anchorId="56234B42" wp14:editId="230B0BCE">
             <wp:extent cx="3000375" cy="1752600"/>
             <wp:effectExtent l="0" t="0" r="0" b="0"/>
             <wp:docPr id="16" name="05c_bulk_done" descr="Summary after saving to the flash drive" title="Summary after saving to the flash drive"/>
@@ -10580,7 +10580,7 @@
       <w:pPr>
         <w:pStyle w:val="Nadpis2"/>
       </w:pPr>
-      <w:bookmarkStart w:id="19" w:name="_Toc244085105"/>
+      <w:bookmarkStart w:id="19" w:name="_Toc244086445"/>
       <w:r>
         <w:t>3.8  Order in progress: finishing and deleting</w:t>
       </w:r>
@@ -10674,7 +10674,7 @@
           <w:noProof/>
         </w:rPr>
         <w:drawing>
-          <wp:inline distT="0" distB="0" distL="0" distR="0" wp14:anchorId="11A01FBD" wp14:editId="46EE4371">
+          <wp:inline distT="0" distB="0" distL="0" distR="0" wp14:anchorId="79D095BB" wp14:editId="520D141A">
             <wp:extent cx="2647950" cy="2771775"/>
             <wp:effectExtent l="0" t="0" r="0" b="0"/>
             <wp:docPr id="17" name="05e_finish_wip" descr="Finishing the order in progress without PLC connection" title="Finishing the order in progress without PLC connection"/>
@@ -10776,7 +10776,7 @@
           <w:noProof/>
         </w:rPr>
         <w:drawing>
-          <wp:inline distT="0" distB="0" distL="0" distR="0" wp14:anchorId="3D9E1F37" wp14:editId="762060A9">
+          <wp:inline distT="0" distB="0" distL="0" distR="0" wp14:anchorId="5AC91C4F" wp14:editId="704FEDFE">
             <wp:extent cx="2647950" cy="2505075"/>
             <wp:effectExtent l="0" t="0" r="0" b="0"/>
             <wp:docPr id="18" name="05d_delete_wip" descr="Deleting the order in progress — confirming the risk" title="Deleting the order in progress — confirming the risk"/>
@@ -10843,7 +10843,7 @@
       <w:pPr>
         <w:pStyle w:val="Nadpis2"/>
       </w:pPr>
-      <w:bookmarkStart w:id="20" w:name="_Toc244085106"/>
+      <w:bookmarkStart w:id="20" w:name="_Toc244086446"/>
       <w:r>
         <w:t>3.9  Deleting files</w:t>
       </w:r>
@@ -10988,7 +10988,7 @@
       <w:pPr>
         <w:pStyle w:val="Nadpis2"/>
       </w:pPr>
-      <w:bookmarkStart w:id="21" w:name="_Toc244085107"/>
+      <w:bookmarkStart w:id="21" w:name="_Toc244086447"/>
       <w:r>
         <w:t>3.10  Remote storage (NAS)</w:t>
       </w:r>
@@ -11023,7 +11023,7 @@
           <w:noProof/>
         </w:rPr>
         <w:drawing>
-          <wp:inline distT="0" distB="0" distL="0" distR="0" wp14:anchorId="532931DF" wp14:editId="6E6B293A">
+          <wp:inline distT="0" distB="0" distL="0" distR="0" wp14:anchorId="456A2DAC" wp14:editId="1566F7D4">
             <wp:extent cx="6124575" cy="3448050"/>
             <wp:effectExtent l="0" t="0" r="0" b="0"/>
             <wp:docPr id="19" name="06_remote" descr="Order archive on the NAS" title="Order archive on the NAS"/>
@@ -11090,7 +11090,7 @@
       <w:pPr>
         <w:pStyle w:val="Nadpis2"/>
       </w:pPr>
-      <w:bookmarkStart w:id="22" w:name="_Toc244085108"/>
+      <w:bookmarkStart w:id="22" w:name="_Toc244086448"/>
       <w:r>
         <w:t>3.11  Test measurements (Testing)</w:t>
       </w:r>
@@ -11125,7 +11125,7 @@
           <w:noProof/>
         </w:rPr>
         <w:drawing>
-          <wp:inline distT="0" distB="0" distL="0" distR="0" wp14:anchorId="20198185" wp14:editId="0D8A9114">
+          <wp:inline distT="0" distB="0" distL="0" distR="0" wp14:anchorId="2A3E396A" wp14:editId="302D503B">
             <wp:extent cx="6124575" cy="3448050"/>
             <wp:effectExtent l="0" t="0" r="0" b="0"/>
             <wp:docPr id="20" name="07_testing_list" descr="List of test measurements" title="List of test measurements"/>
@@ -11193,7 +11193,7 @@
         <w:pStyle w:val="Nadpis1"/>
         <w:pageBreakBefore/>
       </w:pPr>
-      <w:bookmarkStart w:id="23" w:name="_Toc244085109"/>
+      <w:bookmarkStart w:id="23" w:name="_Toc244086449"/>
       <w:r>
         <w:t>4  Order detail</w:t>
       </w:r>
@@ -11238,7 +11238,7 @@
           <w:noProof/>
         </w:rPr>
         <w:drawing>
-          <wp:inline distT="0" distB="0" distL="0" distR="0" wp14:anchorId="17EC63DD" wp14:editId="62BFE695">
+          <wp:inline distT="0" distB="0" distL="0" distR="0" wp14:anchorId="556BAE2A" wp14:editId="1F056D15">
             <wp:extent cx="6124575" cy="3448050"/>
             <wp:effectExtent l="0" t="0" r="0" b="0"/>
             <wp:docPr id="21" name="08_order" descr="Order detail — header, order data and category distribution" title="Order detail — header, order data and category distribution"/>
@@ -11305,7 +11305,7 @@
       <w:pPr>
         <w:pStyle w:val="Nadpis2"/>
       </w:pPr>
-      <w:bookmarkStart w:id="24" w:name="_Toc244085110"/>
+      <w:bookmarkStart w:id="24" w:name="_Toc244086450"/>
       <w:r>
         <w:t>4.1  Order header</w:t>
       </w:r>
@@ -11322,7 +11322,7 @@
           <w:noProof/>
         </w:rPr>
         <w:drawing>
-          <wp:inline distT="0" distB="0" distL="0" distR="0" wp14:anchorId="76FDBF09" wp14:editId="7F96C576">
+          <wp:inline distT="0" distB="0" distL="0" distR="0" wp14:anchorId="2E3680B8" wp14:editId="7BF4CE42">
             <wp:extent cx="6124575" cy="1000125"/>
             <wp:effectExtent l="0" t="0" r="0" b="0"/>
             <wp:docPr id="22" name="08b_hero" descr="Order header" title="Order header"/>
@@ -11397,7 +11397,7 @@
       <w:pPr>
         <w:pStyle w:val="Nadpis2"/>
       </w:pPr>
-      <w:bookmarkStart w:id="25" w:name="_Toc244085111"/>
+      <w:bookmarkStart w:id="25" w:name="_Toc244086451"/>
       <w:r>
         <w:t>4.2  Order data</w:t>
       </w:r>
@@ -11432,7 +11432,7 @@
           <w:noProof/>
         </w:rPr>
         <w:drawing>
-          <wp:inline distT="0" distB="0" distL="0" distR="0" wp14:anchorId="5622302F" wp14:editId="789F5FB3">
+          <wp:inline distT="0" distB="0" distL="0" distR="0" wp14:anchorId="7999BBC0" wp14:editId="19C4A5AB">
             <wp:extent cx="6124575" cy="1238250"/>
             <wp:effectExtent l="0" t="0" r="0" b="0"/>
             <wp:docPr id="23" name="08d_orderinfo" descr="Order data — collapsed rows with summary" title="Order data — collapsed rows with summary"/>
@@ -11934,7 +11934,7 @@
           <w:noProof/>
         </w:rPr>
         <w:drawing>
-          <wp:inline distT="0" distB="0" distL="0" distR="0" wp14:anchorId="1527540F" wp14:editId="20D08B02">
+          <wp:inline distT="0" distB="0" distL="0" distR="0" wp14:anchorId="281460C6" wp14:editId="30D142A1">
             <wp:extent cx="6124575" cy="2828925"/>
             <wp:effectExtent l="0" t="0" r="0" b="0"/>
             <wp:docPr id="24" name="08e_orderinfo_cats" descr="Sorting categories by MD" title="Sorting categories by MD"/>
@@ -12008,7 +12008,7 @@
           <w:noProof/>
         </w:rPr>
         <w:drawing>
-          <wp:inline distT="0" distB="0" distL="0" distR="0" wp14:anchorId="7B71911B" wp14:editId="4ED8C0A7">
+          <wp:inline distT="0" distB="0" distL="0" distR="0" wp14:anchorId="66F5E4E4" wp14:editId="025AE6D5">
             <wp:extent cx="6124575" cy="3829050"/>
             <wp:effectExtent l="0" t="0" r="0" b="0"/>
             <wp:docPr id="25" name="08f_orderinfo_limits" descr="Sorting limits — active only (detail)" title="Sorting limits — active only (detail)"/>
@@ -12075,7 +12075,7 @@
       <w:pPr>
         <w:pStyle w:val="Nadpis2"/>
       </w:pPr>
-      <w:bookmarkStart w:id="26" w:name="_Toc244085112"/>
+      <w:bookmarkStart w:id="26" w:name="_Toc244086452"/>
       <w:r>
         <w:t>4.3  Category distribution</w:t>
       </w:r>
@@ -12100,7 +12100,7 @@
           <w:noProof/>
         </w:rPr>
         <w:drawing>
-          <wp:inline distT="0" distB="0" distL="0" distR="0" wp14:anchorId="6C63ACA5" wp14:editId="46E317F3">
+          <wp:inline distT="0" distB="0" distL="0" distR="0" wp14:anchorId="74563159" wp14:editId="29B0177A">
             <wp:extent cx="6124575" cy="1971675"/>
             <wp:effectExtent l="0" t="0" r="0" b="0"/>
             <wp:docPr id="26" name="08c_categories" descr="Category distribution of an order" title="Category distribution of an order"/>
@@ -12607,7 +12607,7 @@
       <w:pPr>
         <w:pStyle w:val="Nadpis2"/>
       </w:pPr>
-      <w:bookmarkStart w:id="27" w:name="_Toc244085113"/>
+      <w:bookmarkStart w:id="27" w:name="_Toc244086453"/>
       <w:r>
         <w:t>4.4  Timeline</w:t>
       </w:r>
@@ -12642,7 +12642,7 @@
           <w:noProof/>
         </w:rPr>
         <w:drawing>
-          <wp:inline distT="0" distB="0" distL="0" distR="0" wp14:anchorId="111A8F3C" wp14:editId="42F5AEFD">
+          <wp:inline distT="0" distB="0" distL="0" distR="0" wp14:anchorId="63815C57" wp14:editId="74C05835">
             <wp:extent cx="6124575" cy="1971675"/>
             <wp:effectExtent l="0" t="0" r="0" b="0"/>
             <wp:docPr id="27" name="09_timeline" descr="Order timeline" title="Order timeline"/>
@@ -13227,7 +13227,7 @@
       <w:pPr>
         <w:pStyle w:val="Nadpis2"/>
       </w:pPr>
-      <w:bookmarkStart w:id="28" w:name="_Toc244085114"/>
+      <w:bookmarkStart w:id="28" w:name="_Toc244086454"/>
       <w:r>
         <w:t>4.5  Piece table and values outside the limits</w:t>
       </w:r>
@@ -13302,7 +13302,7 @@
           <w:noProof/>
         </w:rPr>
         <w:drawing>
-          <wp:inline distT="0" distB="0" distL="0" distR="0" wp14:anchorId="6646F09B" wp14:editId="4A895C33">
+          <wp:inline distT="0" distB="0" distL="0" distR="0" wp14:anchorId="1204EAF5" wp14:editId="61B67CAA">
             <wp:extent cx="6124575" cy="3829050"/>
             <wp:effectExtent l="0" t="0" r="0" b="0"/>
             <wp:docPr id="28" name="10b_tabs" descr="Piece table — Positions group" title="Piece table — Positions group"/>
@@ -13692,7 +13692,7 @@
       <w:pPr>
         <w:pStyle w:val="Nadpis2"/>
       </w:pPr>
-      <w:bookmarkStart w:id="29" w:name="_Toc244085115"/>
+      <w:bookmarkStart w:id="29" w:name="_Toc244086455"/>
       <w:r>
         <w:t>4.6  Sorting and filtering pieces</w:t>
       </w:r>
@@ -13820,7 +13820,7 @@
           <w:noProof/>
         </w:rPr>
         <w:drawing>
-          <wp:inline distT="0" distB="0" distL="0" distR="0" wp14:anchorId="12A2EDF7" wp14:editId="0F8FE39E">
+          <wp:inline distT="0" distB="0" distL="0" distR="0" wp14:anchorId="30D9606C" wp14:editId="1E54E0D5">
             <wp:extent cx="6124575" cy="3829050"/>
             <wp:effectExtent l="0" t="0" r="0" b="0"/>
             <wp:docPr id="29" name="11_filter" descr="Filter — NOK pieces only, with values outside the limits tinted" title="Filter — NOK pieces only, with values outside the limits tinted"/>
@@ -13894,7 +13894,7 @@
           <w:noProof/>
         </w:rPr>
         <w:drawing>
-          <wp:inline distT="0" distB="0" distL="0" distR="0" wp14:anchorId="1E1BD16F" wp14:editId="2C3E492C">
+          <wp:inline distT="0" distB="0" distL="0" distR="0" wp14:anchorId="39421DCD" wp14:editId="387E13D2">
             <wp:extent cx="6124575" cy="647700"/>
             <wp:effectExtent l="0" t="0" r="0" b="0"/>
             <wp:docPr id="30" name="11b_filter_nok" descr="NOK area filter — pieces failing in Position" title="NOK area filter — pieces failing in Position"/>
@@ -13961,7 +13961,7 @@
       <w:pPr>
         <w:pStyle w:val="Nadpis2"/>
       </w:pPr>
-      <w:bookmarkStart w:id="30" w:name="_Toc244085116"/>
+      <w:bookmarkStart w:id="30" w:name="_Toc244086456"/>
       <w:r>
         <w:t>4.7  Exporting and printing an order</w:t>
       </w:r>
@@ -14020,7 +14020,7 @@
         <w:pStyle w:val="Nadpis1"/>
         <w:pageBreakBefore/>
       </w:pPr>
-      <w:bookmarkStart w:id="31" w:name="_Toc244085117"/>
+      <w:bookmarkStart w:id="31" w:name="_Toc244086457"/>
       <w:r>
         <w:t>5  Record detail (piece)</w:t>
       </w:r>
@@ -14055,7 +14055,7 @@
           <w:noProof/>
         </w:rPr>
         <w:drawing>
-          <wp:inline distT="0" distB="0" distL="0" distR="0" wp14:anchorId="6C89D926" wp14:editId="7F5C8189">
+          <wp:inline distT="0" distB="0" distL="0" distR="0" wp14:anchorId="57CB2AAA" wp14:editId="2830B19F">
             <wp:extent cx="6124575" cy="3448050"/>
             <wp:effectExtent l="0" t="0" r="0" b="0"/>
             <wp:docPr id="31" name="13_record" descr="Record detail — force–travel and switching time diagrams" title="Record detail — force–travel and switching time diagrams"/>
@@ -14122,7 +14122,7 @@
       <w:pPr>
         <w:pStyle w:val="Nadpis2"/>
       </w:pPr>
-      <w:bookmarkStart w:id="32" w:name="_Toc244085118"/>
+      <w:bookmarkStart w:id="32" w:name="_Toc244086458"/>
       <w:r>
         <w:t>5.1  Force–travel diagram</w:t>
       </w:r>
@@ -14375,7 +14375,7 @@
                 <w:sz w:val="18"/>
                 <w:szCs w:val="18"/>
               </w:rPr>
-              <w:t>Operating position on the forward stroke – since Analyzing 2.6.3 the first closing of the NO contact (in older files the opening of the NC contact).</w:t>
+              <w:t>Operating position on the forward stroke – the first closing of the NO contact.</w:t>
             </w:r>
           </w:p>
         </w:tc>
@@ -15168,33 +15168,9 @@
     </w:p>
     <w:p>
       <w:pPr>
-        <w:pBdr>
-          <w:left w:val="single" w:sz="18" w:space="8" w:color="374151"/>
-        </w:pBdr>
-        <w:shd w:val="clear" w:color="auto" w:fill="F3F4F6"/>
-        <w:spacing w:before="120" w:after="180" w:line="276" w:lineRule="auto"/>
-        <w:ind w:left="160" w:right="120"/>
-      </w:pPr>
-      <w:r>
-        <w:rPr>
-          <w:b/>
-          <w:bCs/>
-          <w:color w:val="374151"/>
-        </w:rPr>
-        <w:t xml:space="preserve">Note: </w:t>
-      </w:r>
-      <w:r>
-        <w:t>The definition of RvT changed with Analyzing 2.6.3 (27 Oct 2026): previously the travel from the end of travel back to RP (TTP → RP), now the travel from the free position to RP (FP → RP); the new value is therefore considerably smaller. The application recognises for every piece which definition applies and labels the dimension “RvT (TTP → RP)” for older files. In files written before customer units were introduced (until 11 Oct 2026) the positions are on the encoder scale — they increase when actuated; th</w:t>
-      </w:r>
-      <w:r>
-        <w:t>e application shows a note. For files without the calibration constant C, C is derived (C = TTP + maximum carriage travel).</w:t>
-      </w:r>
-    </w:p>
-    <w:p>
-      <w:pPr>
         <w:pStyle w:val="Nadpis2"/>
       </w:pPr>
-      <w:bookmarkStart w:id="33" w:name="_Toc244085119"/>
+      <w:bookmarkStart w:id="33" w:name="_Toc244086459"/>
       <w:r>
         <w:t>5.2  Contact switching times</w:t>
       </w:r>
@@ -15205,7 +15181,7 @@
         <w:spacing w:after="120" w:line="288" w:lineRule="auto"/>
       </w:pPr>
       <w:r>
-        <w:t>The voltage of the NO (top) and NC (bottom) contacts during the changeover, similar to an oscilloscope. Time 0 is the start of opening of the NC contact (the axis label in the application says “0 = OP” according to the older OP definition; since Analyzing 2.6.3 OP lies at the end of RevT, at the first closing of NO). Marked times:</w:t>
+        <w:t>The voltage of the NO (top) and NC (bottom) contacts during the changeover, similar to an oscilloscope. Time 0 is the start of opening of the NC contact. Marked times:</w:t>
       </w:r>
     </w:p>
     <w:p>
@@ -15308,7 +15284,7 @@
       <w:pPr>
         <w:pStyle w:val="Nadpis2"/>
       </w:pPr>
-      <w:bookmarkStart w:id="34" w:name="_Toc244085120"/>
+      <w:bookmarkStart w:id="34" w:name="_Toc244086460"/>
       <w:r>
         <w:t>5.3  NOK categories and parameter table</w:t>
       </w:r>
@@ -15361,7 +15337,7 @@
           <w:noProof/>
         </w:rPr>
         <w:drawing>
-          <wp:inline distT="0" distB="0" distL="0" distR="0" wp14:anchorId="1AE252FE" wp14:editId="7796953D">
+          <wp:inline distT="0" distB="0" distL="0" distR="0" wp14:anchorId="6F1AEFE2" wp14:editId="7771AA1C">
             <wp:extent cx="6124575" cy="4619625"/>
             <wp:effectExtent l="0" t="0" r="0" b="0"/>
             <wp:docPr id="32" name="13b_param_explain" descr="Graphical explanation of the RvT parameter" title="Graphical explanation of the RvT parameter"/>
@@ -15428,7 +15404,7 @@
       <w:pPr>
         <w:pStyle w:val="Nadpis2"/>
       </w:pPr>
-      <w:bookmarkStart w:id="35" w:name="_Toc244085121"/>
+      <w:bookmarkStart w:id="35" w:name="_Toc244086461"/>
       <w:r>
         <w:t>5.4  Printing a record report</w:t>
       </w:r>
@@ -15473,7 +15449,7 @@
           <w:noProof/>
         </w:rPr>
         <w:drawing>
-          <wp:inline distT="0" distB="0" distL="0" distR="0" wp14:anchorId="66E8437D" wp14:editId="7771F5D6">
+          <wp:inline distT="0" distB="0" distL="0" distR="0" wp14:anchorId="5E97DB7F" wp14:editId="02CC8390">
             <wp:extent cx="3800475" cy="5372100"/>
             <wp:effectExtent l="0" t="0" r="0" b="0"/>
             <wp:docPr id="33" name="12_print_record" descr="Printed record report (page 1)" title="Printed record report (page 1)"/>
@@ -15562,7 +15538,7 @@
         <w:pStyle w:val="Nadpis1"/>
         <w:pageBreakBefore/>
       </w:pPr>
-      <w:bookmarkStart w:id="36" w:name="_Toc244085122"/>
+      <w:bookmarkStart w:id="36" w:name="_Toc244086462"/>
       <w:r>
         <w:t>6  Measurement detail (Testing)</w:t>
       </w:r>
@@ -15587,7 +15563,7 @@
           <w:noProof/>
         </w:rPr>
         <w:drawing>
-          <wp:inline distT="0" distB="0" distL="0" distR="0" wp14:anchorId="69F1145E" wp14:editId="60A73D47">
+          <wp:inline distT="0" distB="0" distL="0" distR="0" wp14:anchorId="7ADFD86B" wp14:editId="787E680C">
             <wp:extent cx="6124575" cy="3448050"/>
             <wp:effectExtent l="0" t="0" r="0" b="0"/>
             <wp:docPr id="34" name="14_testing" descr="Measurement detail — Test setup" title="Measurement detail — Test setup"/>
@@ -16106,7 +16082,7 @@
           <w:noProof/>
         </w:rPr>
         <w:drawing>
-          <wp:inline distT="0" distB="0" distL="0" distR="0" wp14:anchorId="0AE6B28D" wp14:editId="4F5C71F6">
+          <wp:inline distT="0" distB="0" distL="0" distR="0" wp14:anchorId="246A89C6" wp14:editId="26343CAF">
             <wp:extent cx="6124575" cy="3448050"/>
             <wp:effectExtent l="0" t="0" r="0" b="0"/>
             <wp:docPr id="35" name="17_test_results" descr="Measurement results" title="Measurement results"/>
@@ -16180,7 +16156,7 @@
           <w:noProof/>
         </w:rPr>
         <w:drawing>
-          <wp:inline distT="0" distB="0" distL="0" distR="0" wp14:anchorId="288CC0B0" wp14:editId="3AC8DD01">
+          <wp:inline distT="0" distB="0" distL="0" distR="0" wp14:anchorId="3D08D18D" wp14:editId="165BEF1C">
             <wp:extent cx="6124575" cy="3448050"/>
             <wp:effectExtent l="0" t="0" r="0" b="0"/>
             <wp:docPr id="36" name="18_test_nok" descr="NOK evaluation — the measurement failed in the Times area" title="NOK evaluation — the measurement failed in the Times area"/>
@@ -16247,7 +16223,7 @@
       <w:pPr>
         <w:pStyle w:val="Nadpis2"/>
       </w:pPr>
-      <w:bookmarkStart w:id="37" w:name="_Toc244085123"/>
+      <w:bookmarkStart w:id="37" w:name="_Toc244086463"/>
       <w:r>
         <w:t>6.1  Signal data</w:t>
       </w:r>
@@ -16268,10 +16244,7 @@
         <w:t>Signal data</w:t>
       </w:r>
       <w:r>
-        <w:t xml:space="preserve"> tab shows the measurement in charts; the number of samples is at the top right. Positions use the same coordinates as the results (height above the mounting-hole axis, C in the axis label). The RP point is determined electrically — by the NC contact changeover at a threshold of 50% of the U_NC voltage range, as in the analysis. Since Analyzing 2.6.3 the OP point is the first closing of the NO contact (position taken from the results table); in older files it is the opening of the NC contact at the same thr</w:t>
-      </w:r>
-      <w:r>
-        <w:t>eshold. The charts have five sub-tabs:</w:t>
+        <w:t xml:space="preserve"> tab shows the measurement in charts; the number of samples is at the top right. Positions use the same coordinates as the results (height above the mounting-hole axis, C in the axis label). The RP point is determined electrically — by the NC contact changeover at a threshold of 50% of the U_NC voltage range, as in the analysis. The OP point is the first closing of the NO contact (position taken from the results table). The charts have five sub-tabs:</w:t>
       </w:r>
     </w:p>
     <w:p>
@@ -16730,7 +16703,7 @@
           <w:noProof/>
         </w:rPr>
         <w:drawing>
-          <wp:inline distT="0" distB="0" distL="0" distR="0" wp14:anchorId="46D34AA0" wp14:editId="32E2BF1B">
+          <wp:inline distT="0" distB="0" distL="0" distR="0" wp14:anchorId="5FF0B353" wp14:editId="301C7329">
             <wp:extent cx="6124575" cy="3448050"/>
             <wp:effectExtent l="0" t="0" r="0" b="0"/>
             <wp:docPr id="37" name="20a_sig_overview" descr="Signal data — Overview" title="Signal data — Overview"/>
@@ -16804,7 +16777,7 @@
           <w:noProof/>
         </w:rPr>
         <w:drawing>
-          <wp:inline distT="0" distB="0" distL="0" distR="0" wp14:anchorId="3FCA46A0" wp14:editId="4E043D78">
+          <wp:inline distT="0" distB="0" distL="0" distR="0" wp14:anchorId="4E7AB6F9" wp14:editId="54CA4872">
             <wp:extent cx="6124575" cy="3448050"/>
             <wp:effectExtent l="0" t="0" r="0" b="0"/>
             <wp:docPr id="38" name="20c_sig_hysteresis" descr="Signal data — Hysteresis" title="Signal data — Hysteresis"/>
@@ -16878,7 +16851,7 @@
           <w:noProof/>
         </w:rPr>
         <w:drawing>
-          <wp:inline distT="0" distB="0" distL="0" distR="0" wp14:anchorId="13B6FA2A" wp14:editId="6DA7E15D">
+          <wp:inline distT="0" distB="0" distL="0" distR="0" wp14:anchorId="6F4A1D05" wp14:editId="09484055">
             <wp:extent cx="6124575" cy="3448050"/>
             <wp:effectExtent l="0" t="0" r="0" b="0"/>
             <wp:docPr id="39" name="20d_sig_switching" descr="Signal data — Switching detail" title="Signal data — Switching detail"/>
@@ -16952,7 +16925,7 @@
           <w:noProof/>
         </w:rPr>
         <w:drawing>
-          <wp:inline distT="0" distB="0" distL="0" distR="0" wp14:anchorId="5C7DB142" wp14:editId="5D061035">
+          <wp:inline distT="0" distB="0" distL="0" distR="0" wp14:anchorId="33D8A591" wp14:editId="1954775B">
             <wp:extent cx="6124575" cy="3448050"/>
             <wp:effectExtent l="0" t="0" r="0" b="0"/>
             <wp:docPr id="40" name="20e_sig_timing" descr="Signal data — Timing detail (UT, RevT, BT, OpT; definitions in section 5.2)" title="Signal data — Timing detail (UT, RevT, BT, OpT; definitions in section 5.2)"/>
@@ -17127,7 +17100,7 @@
       <w:pPr>
         <w:pStyle w:val="Nadpis2"/>
       </w:pPr>
-      <w:bookmarkStart w:id="38" w:name="_Toc244085124"/>
+      <w:bookmarkStart w:id="38" w:name="_Toc244086464"/>
       <w:r>
         <w:t>6.2  Printing a measurement report</w:t>
       </w:r>
@@ -17166,7 +17139,7 @@
         <w:pStyle w:val="Nadpis1"/>
         <w:pageBreakBefore/>
       </w:pPr>
-      <w:bookmarkStart w:id="39" w:name="_Toc244085125"/>
+      <w:bookmarkStart w:id="39" w:name="_Toc244086465"/>
       <w:r>
         <w:t>7  Settings</w:t>
       </w:r>
@@ -17184,7 +17157,7 @@
       <w:pPr>
         <w:pStyle w:val="Nadpis2"/>
       </w:pPr>
-      <w:bookmarkStart w:id="40" w:name="_Toc244085126"/>
+      <w:bookmarkStart w:id="40" w:name="_Toc244086466"/>
       <w:r>
         <w:t>7.1  Preferences</w:t>
       </w:r>
@@ -17654,7 +17627,7 @@
           <w:noProof/>
         </w:rPr>
         <w:drawing>
-          <wp:inline distT="0" distB="0" distL="0" distR="0" wp14:anchorId="4CA8BC49" wp14:editId="004C201A">
+          <wp:inline distT="0" distB="0" distL="0" distR="0" wp14:anchorId="5873A311" wp14:editId="6743A82D">
             <wp:extent cx="6124575" cy="2133600"/>
             <wp:effectExtent l="0" t="0" r="0" b="0"/>
             <wp:docPr id="41" name="21_settings_prefs" descr="Settings — Preferences" title="Settings — Preferences"/>
@@ -17721,7 +17694,7 @@
       <w:pPr>
         <w:pStyle w:val="Nadpis2"/>
       </w:pPr>
-      <w:bookmarkStart w:id="41" w:name="_Toc244085127"/>
+      <w:bookmarkStart w:id="41" w:name="_Toc244086467"/>
       <w:r>
         <w:t>7.2  Connection</w:t>
       </w:r>
@@ -17756,7 +17729,7 @@
           <w:noProof/>
         </w:rPr>
         <w:drawing>
-          <wp:inline distT="0" distB="0" distL="0" distR="0" wp14:anchorId="03784849" wp14:editId="3879CCE6">
+          <wp:inline distT="0" distB="0" distL="0" distR="0" wp14:anchorId="2997C0DB" wp14:editId="3DCE6AB9">
             <wp:extent cx="6124575" cy="3495675"/>
             <wp:effectExtent l="0" t="0" r="0" b="0"/>
             <wp:docPr id="42" name="22_settings_conn" descr="Settings — Connection" title="Settings — Connection"/>
@@ -17823,7 +17796,7 @@
       <w:pPr>
         <w:pStyle w:val="Nadpis2"/>
       </w:pPr>
-      <w:bookmarkStart w:id="42" w:name="_Toc244085128"/>
+      <w:bookmarkStart w:id="42" w:name="_Toc244086468"/>
       <w:r>
         <w:t>7.3  Time / NTP</w:t>
       </w:r>
@@ -17879,7 +17852,7 @@
           <w:noProof/>
         </w:rPr>
         <w:drawing>
-          <wp:inline distT="0" distB="0" distL="0" distR="0" wp14:anchorId="33B65421" wp14:editId="74C64F00">
+          <wp:inline distT="0" distB="0" distL="0" distR="0" wp14:anchorId="32E11AE4" wp14:editId="00D174F3">
             <wp:extent cx="6124575" cy="2400300"/>
             <wp:effectExtent l="0" t="0" r="0" b="0"/>
             <wp:docPr id="43" name="22b_settings_time" descr="Settings — Time / NTP" title="Settings — Time / NTP"/>
@@ -18012,7 +17985,7 @@
       <w:pPr>
         <w:pStyle w:val="Nadpis2"/>
       </w:pPr>
-      <w:bookmarkStart w:id="43" w:name="_Toc244085129"/>
+      <w:bookmarkStart w:id="43" w:name="_Toc244086469"/>
       <w:r>
         <w:t>7.4  Users</w:t>
       </w:r>
@@ -18133,7 +18106,7 @@
           <w:noProof/>
         </w:rPr>
         <w:drawing>
-          <wp:inline distT="0" distB="0" distL="0" distR="0" wp14:anchorId="76D1AB1B" wp14:editId="649E319A">
+          <wp:inline distT="0" distB="0" distL="0" distR="0" wp14:anchorId="7E8032C4" wp14:editId="172874A7">
             <wp:extent cx="6124575" cy="1724025"/>
             <wp:effectExtent l="0" t="0" r="0" b="0"/>
             <wp:docPr id="44" name="23_settings_users" descr="Settings — Users" title="Settings — Users"/>
@@ -18201,7 +18174,7 @@
         <w:pStyle w:val="Nadpis1"/>
         <w:pageBreakBefore/>
       </w:pPr>
-      <w:bookmarkStart w:id="44" w:name="_Toc244085130"/>
+      <w:bookmarkStart w:id="44" w:name="_Toc244086470"/>
       <w:r>
         <w:t>8  Info</w:t>
       </w:r>
@@ -18226,7 +18199,7 @@
           <w:noProof/>
         </w:rPr>
         <w:drawing>
-          <wp:inline distT="0" distB="0" distL="0" distR="0" wp14:anchorId="23E1D875" wp14:editId="2A39CF7B">
+          <wp:inline distT="0" distB="0" distL="0" distR="0" wp14:anchorId="060FFBD2" wp14:editId="2E3C4FE7">
             <wp:extent cx="6124575" cy="1685925"/>
             <wp:effectExtent l="0" t="0" r="0" b="0"/>
             <wp:docPr id="45" name="24_info" descr="Info page" title="Info page"/>
@@ -18294,7 +18267,7 @@
         <w:pStyle w:val="Nadpis1"/>
         <w:pageBreakBefore/>
       </w:pPr>
-      <w:bookmarkStart w:id="45" w:name="_Toc244085131"/>
+      <w:bookmarkStart w:id="45" w:name="_Toc244086471"/>
       <w:r>
         <w:t>9  Troubleshooting</w:t>
       </w:r>
@@ -19481,7 +19454,7 @@
         <w:pStyle w:val="Nadpis1"/>
         <w:pageBreakBefore/>
       </w:pPr>
-      <w:bookmarkStart w:id="46" w:name="_Toc244085132"/>
+      <w:bookmarkStart w:id="46" w:name="_Toc244086472"/>
       <w:r>
         <w:t>Appendix A  Parameter overview</w:t>
       </w:r>
@@ -19492,10 +19465,10 @@
         <w:spacing w:after="120" w:line="288" w:lineRule="auto"/>
       </w:pPr>
       <w:r>
-        <w:t>Parameter abbreviations and names are shown in English in the application (technical names as used by the customer). Value format: forces in mN (integers), positions and travels in µm with a resolution of 0.1 µm, times in µs, contact resistances in mΩ with a resolution of 0.1 mΩ; a resistance above 999.9 mΩ (open contact) is shown as ∞, an undetermined value as “—”. The abbreviations OvT and RvT (travels) differ from OpT and RevT (times) to avoid confusion. The parameters DF and FPR are present in files fro</w:t>
-      </w:r>
-      <w:r>
-        <w:t>m 21 Oct 2026, the static resistances from 22 Oct 2026; older files do not contain them. The descriptions of UT and RevT given here are more precise than the “?” help in the application and follow the calculation in Analyzing (see section 5.2).</w:t>
+        <w:t>Parameter abbreviations and names are shown in English in the application (technical names as used by the customer). Value format: forces in mN (integers), positions and travels in µm with a resolution of 0.1 µm, times in µs, contact resistances in mΩ with a resolution of 0.1 mΩ; a resistance above 999.9 mΩ (open contact) is shown as ∞, an undetermined value as “—”. The abbreviations OvT and RvT (travels) differ from OpT and RevT (times) to avoid confusion. The descriptions of UT and RevT given here are mor</w:t>
+      </w:r>
+      <w:r>
+        <w:t>e precise than the “?” help in the application and follow the calculation in Analyzing (see section 5.2).</w:t>
       </w:r>
     </w:p>
     <w:p>
@@ -22938,7 +22911,7 @@
         <w:pStyle w:val="Nadpis1"/>
         <w:pageBreakBefore/>
       </w:pPr>
-      <w:bookmarkStart w:id="47" w:name="_Toc244085133"/>
+      <w:bookmarkStart w:id="47" w:name="_Toc244086473"/>
       <w:r>
         <w:t>Appendix B  Terms and abbreviations</w:t>
       </w:r>
@@ -25117,213 +25090,213 @@
 <file path=word/numbering.xml><?xml version="1.0" encoding="utf-8"?>
 <w:numbering xmlns:wpc="http://schemas.microsoft.com/office/word/2010/wordprocessingCanvas" xmlns:cx="http://schemas.microsoft.com/office/drawing/2014/chartex" xmlns:cx1="http://schemas.microsoft.com/office/drawing/2015/9/8/chartex" xmlns:cx2="http://schemas.microsoft.com/office/drawing/2015/10/21/chartex" xmlns:cx3="http://schemas.microsoft.com/office/drawing/2016/5/9/chartex" xmlns:cx4="http://schemas.microsoft.com/office/drawing/2016/5/10/chartex" xmlns:cx5="http://schemas.microsoft.com/office/drawing/2016/5/11/chartex" xmlns:cx6="http://schemas.microsoft.com/office/drawing/2016/5/12/chartex" xmlns:cx7="http://schemas.microsoft.com/office/drawing/2016/5/13/chartex" xmlns:cx8="http://schemas.microsoft.com/office/drawing/2016/5/14/chartex" xmlns:mc="http://schemas.openxmlformats.org/markup-compatibility/2006" xmlns:aink="http://schemas.microsoft.com/office/drawing/2016/ink" xmlns:am3d="http://schemas.microsoft.com/office/drawing/2017/model3d" xmlns:o="urn:schemas-microsoft-com:office:office" xmlns:oel="http://schemas.microsoft.com/office/2019/extlst" xmlns:r="http://schemas.openxmlformats.org/officeDocument/2006/relationships" xmlns:m="http://schemas.openxmlformats.org/officeDocument/2006/math" xmlns:v="urn:schemas-microsoft-com:vml" xmlns:wp14="http://schemas.microsoft.com/office/word/2010/wordprocessingDrawing" xmlns:wp="http://schemas.openxmlformats.org/drawingml/2006/wordprocessingDrawing" xmlns:w10="urn:schemas-microsoft-com:office:word" xmlns:w="http://schemas.openxmlformats.org/wordprocessingml/2006/main" xmlns:w14="http://schemas.microsoft.com/office/word/2010/wordml" xmlns:w15="http://schemas.microsoft.com/office/word/2012/wordml" xmlns:w16cex="http://schemas.microsoft.com/office/word/2018/wordml/cex" xmlns:w16cid="http://schemas.microsoft.com/office/word/2016/wordml/cid" xmlns:w16="http://schemas.microsoft.com/office/word/2018/wordml" xmlns:w16du="http://schemas.microsoft.com/office/word/2023/wordml/word16du" xmlns:w16sdtdh="http://schemas.microsoft.com/office/word/2020/wordml/sdtdatahash" xmlns:w16sdtfl="http://schemas.microsoft.com/office/word/2024/wordml/sdtformatlock" xmlns:w16se="http://schemas.microsoft.com/office/word/2015/wordml/symex" xmlns:wpg="http://schemas.microsoft.com/office/word/2010/wordprocessingGroup" xmlns:wpi="http://schemas.microsoft.com/office/word/2010/wordprocessingInk" xmlns:wne="http://schemas.microsoft.com/office/word/2006/wordml" xmlns:wps="http://schemas.microsoft.com/office/word/2010/wordprocessingShape" mc:Ignorable="w14 w15 w16se w16cid w16 w16cex w16sdtdh w16sdtfl w16du wp14">
   <w:abstractNum w:abstractNumId="0" w15:restartNumberingAfterBreak="0">
-    <w:nsid w:val="48290071"/>
+    <w:nsid w:val="1AB67EEF"/>
     <w:multiLevelType w:val="hybridMultilevel"/>
-    <w:tmpl w:val="3D7E817E"/>
-    <w:lvl w:ilvl="0" w:tplc="569CF1AE">
+    <w:tmpl w:val="840AFDE8"/>
+    <w:lvl w:ilvl="0" w:tplc="7B66769E" w:tentative="1">
       <w:start w:val="1"/>
       <w:numFmt w:val="bullet"/>
-      <w:lvlText w:val="•"/>
+      <w:lvlText w:val="●"/>
       <w:lvlJc w:val="left"/>
       <w:pPr>
-        <w:ind w:left="540" w:hanging="270"/>
+        <w:ind w:left="720" w:hanging="360"/>
       </w:pPr>
     </w:lvl>
-    <w:lvl w:ilvl="1" w:tplc="62388D44">
+    <w:lvl w:ilvl="1" w:tplc="26784B40" w:tentative="1">
+      <w:start w:val="1"/>
+      <w:numFmt w:val="bullet"/>
+      <w:lvlText w:val="○"/>
+      <w:lvlJc w:val="left"/>
+      <w:pPr>
+        <w:ind w:left="1440" w:hanging="360"/>
+      </w:pPr>
+    </w:lvl>
+    <w:lvl w:ilvl="2" w:tplc="5AF6FE84" w:tentative="1">
+      <w:start w:val="1"/>
+      <w:numFmt w:val="bullet"/>
+      <w:lvlText w:val="■"/>
+      <w:lvlJc w:val="left"/>
+      <w:pPr>
+        <w:ind w:left="2160" w:hanging="360"/>
+      </w:pPr>
+    </w:lvl>
+    <w:lvl w:ilvl="3" w:tplc="DCAEB89E" w:tentative="1">
+      <w:start w:val="1"/>
+      <w:numFmt w:val="bullet"/>
+      <w:lvlText w:val="●"/>
+      <w:lvlJc w:val="left"/>
+      <w:pPr>
+        <w:ind w:left="2880" w:hanging="360"/>
+      </w:pPr>
+    </w:lvl>
+    <w:lvl w:ilvl="4" w:tplc="076AD1CC" w:tentative="1">
+      <w:start w:val="1"/>
+      <w:numFmt w:val="bullet"/>
+      <w:lvlText w:val="○"/>
+      <w:lvlJc w:val="left"/>
+      <w:pPr>
+        <w:ind w:left="3600" w:hanging="360"/>
+      </w:pPr>
+    </w:lvl>
+    <w:lvl w:ilvl="5" w:tplc="07DCCF98" w:tentative="1">
+      <w:start w:val="1"/>
+      <w:numFmt w:val="bullet"/>
+      <w:lvlText w:val="■"/>
+      <w:lvlJc w:val="left"/>
+      <w:pPr>
+        <w:ind w:left="4320" w:hanging="360"/>
+      </w:pPr>
+    </w:lvl>
+    <w:lvl w:ilvl="6" w:tplc="A746A472" w:tentative="1">
+      <w:start w:val="1"/>
+      <w:numFmt w:val="bullet"/>
+      <w:lvlText w:val="●"/>
+      <w:lvlJc w:val="left"/>
+      <w:pPr>
+        <w:ind w:left="5040" w:hanging="360"/>
+      </w:pPr>
+    </w:lvl>
+    <w:lvl w:ilvl="7" w:tplc="554CD366" w:tentative="1">
+      <w:start w:val="1"/>
+      <w:numFmt w:val="bullet"/>
+      <w:lvlText w:val="●"/>
+      <w:lvlJc w:val="left"/>
+      <w:pPr>
+        <w:ind w:left="5760" w:hanging="360"/>
+      </w:pPr>
+    </w:lvl>
+    <w:lvl w:ilvl="8" w:tplc="AD5AD47E" w:tentative="1">
+      <w:start w:val="1"/>
+      <w:numFmt w:val="bullet"/>
+      <w:lvlText w:val="●"/>
+      <w:lvlJc w:val="left"/>
+      <w:pPr>
+        <w:ind w:left="6480" w:hanging="360"/>
+      </w:pPr>
+    </w:lvl>
+  </w:abstractNum>
+  <w:abstractNum w:abstractNumId="1" w15:restartNumberingAfterBreak="0">
+    <w:nsid w:val="5CCB26B6"/>
+    <w:multiLevelType w:val="hybridMultilevel"/>
+    <w:tmpl w:val="BED81E10"/>
+    <w:lvl w:ilvl="0" w:tplc="C0064E78">
+      <w:start w:val="1"/>
+      <w:numFmt w:val="decimal"/>
+      <w:lvlText w:val="%1."/>
+      <w:lvlJc w:val="left"/>
+      <w:pPr>
+        <w:ind w:left="540" w:hanging="300"/>
+      </w:pPr>
+    </w:lvl>
+    <w:lvl w:ilvl="1" w:tplc="AE8A5ACA">
       <w:numFmt w:val="decimal"/>
       <w:lvlText w:val=""/>
       <w:lvlJc w:val="left"/>
     </w:lvl>
-    <w:lvl w:ilvl="2" w:tplc="122EDA72">
+    <w:lvl w:ilvl="2" w:tplc="4B2A1098">
       <w:numFmt w:val="decimal"/>
       <w:lvlText w:val=""/>
       <w:lvlJc w:val="left"/>
     </w:lvl>
-    <w:lvl w:ilvl="3" w:tplc="C72692B0">
+    <w:lvl w:ilvl="3" w:tplc="EA36D546">
       <w:numFmt w:val="decimal"/>
       <w:lvlText w:val=""/>
       <w:lvlJc w:val="left"/>
     </w:lvl>
-    <w:lvl w:ilvl="4" w:tplc="DF80D956">
+    <w:lvl w:ilvl="4" w:tplc="74A2F25E">
       <w:numFmt w:val="decimal"/>
       <w:lvlText w:val=""/>
       <w:lvlJc w:val="left"/>
     </w:lvl>
-    <w:lvl w:ilvl="5" w:tplc="5B3A3936">
+    <w:lvl w:ilvl="5" w:tplc="9AF8BBAA">
       <w:numFmt w:val="decimal"/>
       <w:lvlText w:val=""/>
       <w:lvlJc w:val="left"/>
     </w:lvl>
-    <w:lvl w:ilvl="6" w:tplc="5B94A0BE">
+    <w:lvl w:ilvl="6" w:tplc="0EC86414">
       <w:numFmt w:val="decimal"/>
       <w:lvlText w:val=""/>
       <w:lvlJc w:val="left"/>
     </w:lvl>
-    <w:lvl w:ilvl="7" w:tplc="410E12F6">
+    <w:lvl w:ilvl="7" w:tplc="E3746168">
       <w:numFmt w:val="decimal"/>
       <w:lvlText w:val=""/>
       <w:lvlJc w:val="left"/>
     </w:lvl>
-    <w:lvl w:ilvl="8" w:tplc="D1509982">
+    <w:lvl w:ilvl="8" w:tplc="50CE47A6">
       <w:numFmt w:val="decimal"/>
       <w:lvlText w:val=""/>
       <w:lvlJc w:val="left"/>
     </w:lvl>
   </w:abstractNum>
-  <w:abstractNum w:abstractNumId="1" w15:restartNumberingAfterBreak="0">
-    <w:nsid w:val="72A028A4"/>
+  <w:abstractNum w:abstractNumId="2" w15:restartNumberingAfterBreak="0">
+    <w:nsid w:val="672F312D"/>
     <w:multiLevelType w:val="hybridMultilevel"/>
-    <w:tmpl w:val="EA8E0236"/>
-    <w:lvl w:ilvl="0" w:tplc="4F96C6C2" w:tentative="1">
+    <w:tmpl w:val="815630FC"/>
+    <w:lvl w:ilvl="0" w:tplc="7AEC218C">
       <w:start w:val="1"/>
       <w:numFmt w:val="bullet"/>
-      <w:lvlText w:val="●"/>
+      <w:lvlText w:val="•"/>
       <w:lvlJc w:val="left"/>
       <w:pPr>
-        <w:ind w:left="720" w:hanging="360"/>
+        <w:ind w:left="540" w:hanging="270"/>
       </w:pPr>
     </w:lvl>
-    <w:lvl w:ilvl="1" w:tplc="7F8C80AA" w:tentative="1">
-      <w:start w:val="1"/>
-      <w:numFmt w:val="bullet"/>
-      <w:lvlText w:val="○"/>
-      <w:lvlJc w:val="left"/>
-      <w:pPr>
-        <w:ind w:left="1440" w:hanging="360"/>
-      </w:pPr>
-    </w:lvl>
-    <w:lvl w:ilvl="2" w:tplc="72E0718A" w:tentative="1">
-      <w:start w:val="1"/>
-      <w:numFmt w:val="bullet"/>
-      <w:lvlText w:val="■"/>
-      <w:lvlJc w:val="left"/>
-      <w:pPr>
-        <w:ind w:left="2160" w:hanging="360"/>
-      </w:pPr>
-    </w:lvl>
-    <w:lvl w:ilvl="3" w:tplc="1E065444" w:tentative="1">
-      <w:start w:val="1"/>
-      <w:numFmt w:val="bullet"/>
-      <w:lvlText w:val="●"/>
-      <w:lvlJc w:val="left"/>
-      <w:pPr>
-        <w:ind w:left="2880" w:hanging="360"/>
-      </w:pPr>
-    </w:lvl>
-    <w:lvl w:ilvl="4" w:tplc="08866A5A" w:tentative="1">
-      <w:start w:val="1"/>
-      <w:numFmt w:val="bullet"/>
-      <w:lvlText w:val="○"/>
-      <w:lvlJc w:val="left"/>
-      <w:pPr>
-        <w:ind w:left="3600" w:hanging="360"/>
-      </w:pPr>
-    </w:lvl>
-    <w:lvl w:ilvl="5" w:tplc="8F0E7818" w:tentative="1">
-      <w:start w:val="1"/>
-      <w:numFmt w:val="bullet"/>
-      <w:lvlText w:val="■"/>
-      <w:lvlJc w:val="left"/>
-      <w:pPr>
-        <w:ind w:left="4320" w:hanging="360"/>
-      </w:pPr>
-    </w:lvl>
-    <w:lvl w:ilvl="6" w:tplc="C4E4E1F2" w:tentative="1">
-      <w:start w:val="1"/>
-      <w:numFmt w:val="bullet"/>
-      <w:lvlText w:val="●"/>
-      <w:lvlJc w:val="left"/>
-      <w:pPr>
-        <w:ind w:left="5040" w:hanging="360"/>
-      </w:pPr>
-    </w:lvl>
-    <w:lvl w:ilvl="7" w:tplc="90D26666" w:tentative="1">
-      <w:start w:val="1"/>
-      <w:numFmt w:val="bullet"/>
-      <w:lvlText w:val="●"/>
-      <w:lvlJc w:val="left"/>
-      <w:pPr>
-        <w:ind w:left="5760" w:hanging="360"/>
-      </w:pPr>
-    </w:lvl>
-    <w:lvl w:ilvl="8" w:tplc="C3681368" w:tentative="1">
-      <w:start w:val="1"/>
-      <w:numFmt w:val="bullet"/>
-      <w:lvlText w:val="●"/>
-      <w:lvlJc w:val="left"/>
-      <w:pPr>
-        <w:ind w:left="6480" w:hanging="360"/>
-      </w:pPr>
-    </w:lvl>
-  </w:abstractNum>
-  <w:abstractNum w:abstractNumId="2" w15:restartNumberingAfterBreak="0">
-    <w:nsid w:val="7DEB072B"/>
-    <w:multiLevelType w:val="hybridMultilevel"/>
-    <w:tmpl w:val="75B4EA6C"/>
-    <w:lvl w:ilvl="0" w:tplc="B3BA7DA4">
-      <w:start w:val="1"/>
-      <w:numFmt w:val="decimal"/>
-      <w:lvlText w:val="%1."/>
-      <w:lvlJc w:val="left"/>
-      <w:pPr>
-        <w:ind w:left="540" w:hanging="300"/>
-      </w:pPr>
-    </w:lvl>
-    <w:lvl w:ilvl="1" w:tplc="9E0A86A8">
+    <w:lvl w:ilvl="1" w:tplc="81E21CC2">
       <w:numFmt w:val="decimal"/>
       <w:lvlText w:val=""/>
       <w:lvlJc w:val="left"/>
     </w:lvl>
-    <w:lvl w:ilvl="2" w:tplc="80BE85D4">
+    <w:lvl w:ilvl="2" w:tplc="AD728710">
       <w:numFmt w:val="decimal"/>
       <w:lvlText w:val=""/>
       <w:lvlJc w:val="left"/>
     </w:lvl>
-    <w:lvl w:ilvl="3" w:tplc="83388040">
+    <w:lvl w:ilvl="3" w:tplc="107A80EA">
       <w:numFmt w:val="decimal"/>
       <w:lvlText w:val=""/>
       <w:lvlJc w:val="left"/>
     </w:lvl>
-    <w:lvl w:ilvl="4" w:tplc="886E4D64">
+    <w:lvl w:ilvl="4" w:tplc="19D437F4">
       <w:numFmt w:val="decimal"/>
       <w:lvlText w:val=""/>
       <w:lvlJc w:val="left"/>
     </w:lvl>
-    <w:lvl w:ilvl="5" w:tplc="59F6B73C">
+    <w:lvl w:ilvl="5" w:tplc="051EC8E6">
       <w:numFmt w:val="decimal"/>
       <w:lvlText w:val=""/>
       <w:lvlJc w:val="left"/>
     </w:lvl>
-    <w:lvl w:ilvl="6" w:tplc="30626636">
+    <w:lvl w:ilvl="6" w:tplc="98BA8998">
       <w:numFmt w:val="decimal"/>
       <w:lvlText w:val=""/>
       <w:lvlJc w:val="left"/>
     </w:lvl>
-    <w:lvl w:ilvl="7" w:tplc="B950C676">
+    <w:lvl w:ilvl="7" w:tplc="1D386B18">
       <w:numFmt w:val="decimal"/>
       <w:lvlText w:val=""/>
       <w:lvlJc w:val="left"/>
     </w:lvl>
-    <w:lvl w:ilvl="8" w:tplc="41A4A8A2">
+    <w:lvl w:ilvl="8" w:tplc="CE146DE0">
       <w:numFmt w:val="decimal"/>
       <w:lvlText w:val=""/>
       <w:lvlJc w:val="left"/>
     </w:lvl>
   </w:abstractNum>
-  <w:num w:numId="1" w16cid:durableId="472917095">
-    <w:abstractNumId w:val="1"/>
-    <w:lvlOverride w:ilvl="0">
-      <w:startOverride w:val="1"/>
-    </w:lvlOverride>
-  </w:num>
-  <w:num w:numId="2" w16cid:durableId="2050062842">
+  <w:num w:numId="1" w16cid:durableId="1908687953">
     <w:abstractNumId w:val="0"/>
     <w:lvlOverride w:ilvl="0">
       <w:startOverride w:val="1"/>
     </w:lvlOverride>
   </w:num>
-  <w:num w:numId="3" w16cid:durableId="912542101">
+  <w:num w:numId="2" w16cid:durableId="235433561">
     <w:abstractNumId w:val="2"/>
+    <w:lvlOverride w:ilvl="0">
+      <w:startOverride w:val="1"/>
+    </w:lvlOverride>
+  </w:num>
+  <w:num w:numId="3" w16cid:durableId="1909682017">
+    <w:abstractNumId w:val="1"/>
     <w:lvlOverride w:ilvl="0">
       <w:startOverride w:val="1"/>
     </w:lvlOverride>

</xml_diff>